<commit_message>
Ajout de contenu dans la doc
</commit_message>
<xml_diff>
--- a/Documentation/LHO - M5 - PoC Scans.docx
+++ b/Documentation/LHO - M5 - PoC Scans.docx
@@ -714,41 +714,7 @@
             <w:pBdr/>
             <w:spacing w:after="120" w:line="168" w:lineRule="auto"/>
             <w:ind/>
-            <w:jc w:val="right"/>
-            <w:rPr>
-              <w:sz w:val="32"/>
-              <w:szCs w:val="32"/>
-              <w:lang w:val="fr-FR"/>
-            </w:rPr>
-          </w:pPr>
-          <w:r>
-            <w:rPr>
-              <w:sz w:val="32"/>
-              <w:szCs w:val="32"/>
-              <w:lang w:val="fr-FR" w:bidi="fr-FR"/>
-            </w:rPr>
-          </w:r>
-          <w:r>
-            <w:rPr>
-              <w:sz w:val="32"/>
-              <w:szCs w:val="32"/>
-              <w:lang w:val="fr-FR"/>
-            </w:rPr>
-          </w:r>
-          <w:r>
-            <w:rPr>
-              <w:sz w:val="32"/>
-              <w:szCs w:val="32"/>
-              <w:lang w:val="fr-FR"/>
-            </w:rPr>
-          </w:r>
-        </w:p>
-        <w:p>
-          <w:pPr>
-            <w:pBdr/>
-            <w:spacing w:after="120" w:line="168" w:lineRule="auto"/>
-            <w:ind/>
-            <w:jc w:val="right"/>
+            <w:jc w:val="left"/>
             <w:rPr>
               <w:sz w:val="32"/>
               <w:szCs w:val="32"/>
@@ -981,7 +947,7 @@
       <w:sdtContent>
         <w:p>
           <w:pPr>
-            <w:pStyle w:val="1271"/>
+            <w:pStyle w:val="1274"/>
             <w:pBdr/>
             <w:spacing/>
             <w:ind/>
@@ -1016,7 +982,7 @@
         </w:p>
         <w:p>
           <w:pPr>
-            <w:pStyle w:val="1274"/>
+            <w:pStyle w:val="1277"/>
             <w:pBdr/>
             <w:tabs>
               <w:tab w:val="right" w:leader="dot" w:pos="9071"/>
@@ -1051,25 +1017,25 @@
           <w:hyperlink w:tooltip="#_Toc1" w:anchor="_Toc1" w:history="1">
             <w:r>
               <w:rPr>
-                <w:rStyle w:val="1275"/>
+                <w:rStyle w:val="1278"/>
               </w:rPr>
             </w:r>
             <w:r>
               <w:rPr>
-                <w:rStyle w:val="1275"/>
+                <w:rStyle w:val="1278"/>
                 <w:lang w:val="fr-CH"/>
               </w:rPr>
               <w:t xml:space="preserve">1. </w:t>
             </w:r>
             <w:r>
               <w:rPr>
-                <w:rStyle w:val="1275"/>
+                <w:rStyle w:val="1278"/>
               </w:rPr>
               <w:t xml:space="preserve">Contexte et Objectifs</w:t>
             </w:r>
             <w:r>
               <w:rPr>
-                <w:rStyle w:val="1275"/>
+                <w:rStyle w:val="1278"/>
               </w:rPr>
             </w:r>
             <w:r>
@@ -1088,7 +1054,7 @@
         </w:p>
         <w:p>
           <w:pPr>
-            <w:pStyle w:val="1274"/>
+            <w:pStyle w:val="1277"/>
             <w:pBdr/>
             <w:tabs>
               <w:tab w:val="right" w:leader="dot" w:pos="9071"/>
@@ -1101,12 +1067,12 @@
           <w:hyperlink w:tooltip="#_Toc2" w:anchor="_Toc2" w:history="1">
             <w:r>
               <w:rPr>
-                <w:rStyle w:val="1275"/>
+                <w:rStyle w:val="1278"/>
               </w:rPr>
             </w:r>
             <w:r>
               <w:rPr>
-                <w:rStyle w:val="1275"/>
+                <w:rStyle w:val="1278"/>
                 <w:highlight w:val="none"/>
                 <w:lang w:val="fr-CH"/>
               </w:rPr>
@@ -1114,13 +1080,13 @@
             </w:r>
             <w:r>
               <w:rPr>
-                <w:rStyle w:val="1275"/>
+                <w:rStyle w:val="1278"/>
               </w:rPr>
               <w:t xml:space="preserve">Problématique : Pourquoi ne pas stocker et lire le PDF nativement ?</w:t>
             </w:r>
             <w:r>
               <w:rPr>
-                <w:rStyle w:val="1275"/>
+                <w:rStyle w:val="1278"/>
               </w:rPr>
             </w:r>
             <w:r>
@@ -1139,7 +1105,7 @@
         </w:p>
         <w:p>
           <w:pPr>
-            <w:pStyle w:val="1274"/>
+            <w:pStyle w:val="1277"/>
             <w:pBdr/>
             <w:tabs>
               <w:tab w:val="right" w:leader="dot" w:pos="9071"/>
@@ -1152,25 +1118,25 @@
           <w:hyperlink w:tooltip="#_Toc3" w:anchor="_Toc3" w:history="1">
             <w:r>
               <w:rPr>
-                <w:rStyle w:val="1275"/>
+                <w:rStyle w:val="1278"/>
               </w:rPr>
             </w:r>
             <w:r>
               <w:rPr>
-                <w:rStyle w:val="1275"/>
+                <w:rStyle w:val="1278"/>
                 <w:lang w:val="fr-CH"/>
               </w:rPr>
               <w:t xml:space="preserve">3. </w:t>
             </w:r>
             <w:r>
               <w:rPr>
-                <w:rStyle w:val="1275"/>
+                <w:rStyle w:val="1278"/>
               </w:rPr>
               <w:t xml:space="preserve">Architecture de la Solution (Pipeline de Traitement)</w:t>
             </w:r>
             <w:r>
               <w:rPr>
-                <w:rStyle w:val="1275"/>
+                <w:rStyle w:val="1278"/>
               </w:rPr>
             </w:r>
             <w:r>
@@ -1179,6 +1145,158 @@
             <w:r>
               <w:fldChar w:fldCharType="begin"/>
               <w:instrText xml:space="preserve">PAGEREF _Toc3 \h</w:instrText>
+              <w:fldChar w:fldCharType="separate"/>
+              <w:t xml:space="preserve">4</w:t>
+              <w:fldChar w:fldCharType="end"/>
+            </w:r>
+          </w:hyperlink>
+          <w:r/>
+          <w:r/>
+        </w:p>
+        <w:p>
+          <w:pPr>
+            <w:pStyle w:val="1280"/>
+            <w:pBdr/>
+            <w:tabs>
+              <w:tab w:val="right" w:leader="dot" w:pos="9071"/>
+            </w:tabs>
+            <w:spacing/>
+            <w:ind/>
+            <w:rPr/>
+          </w:pPr>
+          <w:r/>
+          <w:hyperlink w:tooltip="#_Toc4" w:anchor="_Toc4" w:history="1">
+            <w:r>
+              <w:rPr>
+                <w:rStyle w:val="1278"/>
+              </w:rPr>
+            </w:r>
+            <w:r>
+              <w:rPr>
+                <w:rStyle w:val="1278"/>
+                <w:highlight w:val="none"/>
+                <w:lang w:val="fr-CH"/>
+              </w:rPr>
+              <w:t xml:space="preserve">3.1 </w:t>
+            </w:r>
+            <w:r>
+              <w:rPr>
+                <w:rStyle w:val="1278"/>
+              </w:rPr>
+              <w:t xml:space="preserve">Phase d'Ingestion (Enregistrement du document)</w:t>
+            </w:r>
+            <w:r>
+              <w:rPr>
+                <w:rStyle w:val="1278"/>
+              </w:rPr>
+            </w:r>
+            <w:r>
+              <w:tab/>
+            </w:r>
+            <w:r>
+              <w:fldChar w:fldCharType="begin"/>
+              <w:instrText xml:space="preserve">PAGEREF _Toc4 \h</w:instrText>
+              <w:fldChar w:fldCharType="separate"/>
+              <w:t xml:space="preserve">4</w:t>
+              <w:fldChar w:fldCharType="end"/>
+            </w:r>
+          </w:hyperlink>
+          <w:r/>
+          <w:r/>
+        </w:p>
+        <w:p>
+          <w:pPr>
+            <w:pStyle w:val="1280"/>
+            <w:pBdr/>
+            <w:tabs>
+              <w:tab w:val="right" w:leader="dot" w:pos="9071"/>
+            </w:tabs>
+            <w:spacing/>
+            <w:ind/>
+            <w:rPr/>
+          </w:pPr>
+          <w:r/>
+          <w:hyperlink w:tooltip="#_Toc5" w:anchor="_Toc5" w:history="1">
+            <w:r>
+              <w:rPr>
+                <w:rStyle w:val="1278"/>
+              </w:rPr>
+            </w:r>
+            <w:r>
+              <w:rPr>
+                <w:rStyle w:val="1278"/>
+                <w:highlight w:val="none"/>
+                <w:lang w:val="fr-CH"/>
+              </w:rPr>
+              <w:t xml:space="preserve">3.2 </w:t>
+            </w:r>
+            <w:r>
+              <w:rPr>
+                <w:rStyle w:val="1278"/>
+              </w:rPr>
+              <w:t xml:space="preserve">Phase de Restitution (PdfViewerControl)</w:t>
+            </w:r>
+            <w:r>
+              <w:rPr>
+                <w:rStyle w:val="1278"/>
+              </w:rPr>
+            </w:r>
+            <w:r>
+              <w:tab/>
+            </w:r>
+            <w:r>
+              <w:fldChar w:fldCharType="begin"/>
+              <w:instrText xml:space="preserve">PAGEREF _Toc5 \h</w:instrText>
+              <w:fldChar w:fldCharType="separate"/>
+              <w:t xml:space="preserve">4</w:t>
+              <w:fldChar w:fldCharType="end"/>
+            </w:r>
+          </w:hyperlink>
+          <w:r/>
+          <w:r/>
+        </w:p>
+        <w:p>
+          <w:pPr>
+            <w:pStyle w:val="1280"/>
+            <w:pBdr/>
+            <w:tabs>
+              <w:tab w:val="right" w:leader="dot" w:pos="9071"/>
+            </w:tabs>
+            <w:spacing/>
+            <w:ind/>
+            <w:rPr/>
+          </w:pPr>
+          <w:r/>
+          <w:hyperlink w:tooltip="#_Toc6" w:anchor="_Toc6" w:history="1">
+            <w:r>
+              <w:rPr>
+                <w:rStyle w:val="1278"/>
+              </w:rPr>
+            </w:r>
+            <w:r>
+              <w:rPr>
+                <w:rStyle w:val="1278"/>
+                <w:lang w:val="fr-CH"/>
+              </w:rPr>
+              <w:t xml:space="preserve">3.3 </w:t>
+            </w:r>
+            <w:r>
+              <w:rPr>
+                <w:rStyle w:val="1278"/>
+              </w:rPr>
+              <w:t xml:space="preserve">Phase d'Exportation (Reconstruction du document)</w:t>
+            </w:r>
+            <w:r>
+              <w:rPr>
+                <w:rStyle w:val="1278"/>
+              </w:rPr>
+            </w:r>
+            <w:r>
+              <w:tab/>
+            </w:r>
+            <w:r>
+              <w:fldChar w:fldCharType="begin"/>
+              <w:instrText xml:space="preserve">PAGEREF _Toc6 \h</w:instrText>
               <w:fldChar w:fldCharType="separate"/>
               <w:t xml:space="preserve">4</w:t>
               <w:fldChar w:fldCharType="end"/>
@@ -1199,167 +1317,15 @@
             <w:rPr/>
           </w:pPr>
           <w:r/>
-          <w:hyperlink w:tooltip="#_Toc4" w:anchor="_Toc4" w:history="1">
+          <w:hyperlink w:tooltip="#_Toc7" w:anchor="_Toc7" w:history="1">
             <w:r>
               <w:rPr>
-                <w:rStyle w:val="1275"/>
+                <w:rStyle w:val="1278"/>
               </w:rPr>
             </w:r>
             <w:r>
               <w:rPr>
-                <w:rStyle w:val="1275"/>
-                <w:highlight w:val="none"/>
-                <w:lang w:val="fr-CH"/>
-              </w:rPr>
-              <w:t xml:space="preserve">3.1 </w:t>
-            </w:r>
-            <w:r>
-              <w:rPr>
-                <w:rStyle w:val="1275"/>
-              </w:rPr>
-              <w:t xml:space="preserve">Phase d'Ingestion (Enregistrement du document)</w:t>
-            </w:r>
-            <w:r>
-              <w:rPr>
-                <w:rStyle w:val="1275"/>
-              </w:rPr>
-            </w:r>
-            <w:r>
-              <w:tab/>
-            </w:r>
-            <w:r>
-              <w:fldChar w:fldCharType="begin"/>
-              <w:instrText xml:space="preserve">PAGEREF _Toc4 \h</w:instrText>
-              <w:fldChar w:fldCharType="separate"/>
-              <w:t xml:space="preserve">4</w:t>
-              <w:fldChar w:fldCharType="end"/>
-            </w:r>
-          </w:hyperlink>
-          <w:r/>
-          <w:r/>
-        </w:p>
-        <w:p>
-          <w:pPr>
-            <w:pStyle w:val="1277"/>
-            <w:pBdr/>
-            <w:tabs>
-              <w:tab w:val="right" w:leader="dot" w:pos="9071"/>
-            </w:tabs>
-            <w:spacing/>
-            <w:ind/>
-            <w:rPr/>
-          </w:pPr>
-          <w:r/>
-          <w:hyperlink w:tooltip="#_Toc5" w:anchor="_Toc5" w:history="1">
-            <w:r>
-              <w:rPr>
-                <w:rStyle w:val="1275"/>
-              </w:rPr>
-            </w:r>
-            <w:r>
-              <w:rPr>
-                <w:rStyle w:val="1275"/>
-                <w:highlight w:val="none"/>
-                <w:lang w:val="fr-CH"/>
-              </w:rPr>
-              <w:t xml:space="preserve">3.2 </w:t>
-            </w:r>
-            <w:r>
-              <w:rPr>
-                <w:rStyle w:val="1275"/>
-              </w:rPr>
-              <w:t xml:space="preserve">Phase de Restitution (PdfViewerControl)</w:t>
-            </w:r>
-            <w:r>
-              <w:rPr>
-                <w:rStyle w:val="1275"/>
-              </w:rPr>
-            </w:r>
-            <w:r>
-              <w:tab/>
-            </w:r>
-            <w:r>
-              <w:fldChar w:fldCharType="begin"/>
-              <w:instrText xml:space="preserve">PAGEREF _Toc5 \h</w:instrText>
-              <w:fldChar w:fldCharType="separate"/>
-              <w:t xml:space="preserve">4</w:t>
-              <w:fldChar w:fldCharType="end"/>
-            </w:r>
-          </w:hyperlink>
-          <w:r/>
-          <w:r/>
-        </w:p>
-        <w:p>
-          <w:pPr>
-            <w:pStyle w:val="1277"/>
-            <w:pBdr/>
-            <w:tabs>
-              <w:tab w:val="right" w:leader="dot" w:pos="9071"/>
-            </w:tabs>
-            <w:spacing/>
-            <w:ind/>
-            <w:rPr/>
-          </w:pPr>
-          <w:r/>
-          <w:hyperlink w:tooltip="#_Toc6" w:anchor="_Toc6" w:history="1">
-            <w:r>
-              <w:rPr>
-                <w:rStyle w:val="1275"/>
-              </w:rPr>
-            </w:r>
-            <w:r>
-              <w:rPr>
-                <w:rStyle w:val="1275"/>
-                <w:lang w:val="fr-CH"/>
-              </w:rPr>
-              <w:t xml:space="preserve">3.3 </w:t>
-            </w:r>
-            <w:r>
-              <w:rPr>
-                <w:rStyle w:val="1275"/>
-              </w:rPr>
-              <w:t xml:space="preserve">Phase d'Exportation (Reconstruction du document)</w:t>
-            </w:r>
-            <w:r>
-              <w:rPr>
-                <w:rStyle w:val="1275"/>
-              </w:rPr>
-            </w:r>
-            <w:r>
-              <w:tab/>
-            </w:r>
-            <w:r>
-              <w:fldChar w:fldCharType="begin"/>
-              <w:instrText xml:space="preserve">PAGEREF _Toc6 \h</w:instrText>
-              <w:fldChar w:fldCharType="separate"/>
-              <w:t xml:space="preserve">4</w:t>
-              <w:fldChar w:fldCharType="end"/>
-            </w:r>
-          </w:hyperlink>
-          <w:r/>
-          <w:r/>
-        </w:p>
-        <w:p>
-          <w:pPr>
-            <w:pStyle w:val="1274"/>
-            <w:pBdr/>
-            <w:tabs>
-              <w:tab w:val="right" w:leader="dot" w:pos="9071"/>
-            </w:tabs>
-            <w:spacing/>
-            <w:ind/>
-            <w:rPr/>
-          </w:pPr>
-          <w:r/>
-          <w:hyperlink w:tooltip="#_Toc7" w:anchor="_Toc7" w:history="1">
-            <w:r>
-              <w:rPr>
-                <w:rStyle w:val="1275"/>
-              </w:rPr>
-            </w:r>
-            <w:r>
-              <w:rPr>
-                <w:rStyle w:val="1275"/>
+                <w:rStyle w:val="1278"/>
                 <w:highlight w:val="none"/>
                 <w:lang w:val="fr-CH"/>
               </w:rPr>
@@ -1367,13 +1333,13 @@
             </w:r>
             <w:r>
               <w:rPr>
-                <w:rStyle w:val="1275"/>
+                <w:rStyle w:val="1278"/>
               </w:rPr>
               <w:t xml:space="preserve">ustifications Techniques Détaillées</w:t>
             </w:r>
             <w:r>
               <w:rPr>
-                <w:rStyle w:val="1275"/>
+                <w:rStyle w:val="1278"/>
               </w:rPr>
             </w:r>
             <w:r>
@@ -1392,7 +1358,7 @@
         </w:p>
         <w:p>
           <w:pPr>
-            <w:pStyle w:val="1277"/>
+            <w:pStyle w:val="1280"/>
             <w:pBdr/>
             <w:tabs>
               <w:tab w:val="right" w:leader="dot" w:pos="9071"/>
@@ -1407,12 +1373,12 @@
           <w:hyperlink w:tooltip="#_Toc8" w:anchor="_Toc8" w:history="1">
             <w:r>
               <w:rPr>
-                <w:rStyle w:val="1275"/>
+                <w:rStyle w:val="1278"/>
               </w:rPr>
             </w:r>
             <w:r>
               <w:rPr>
-                <w:rStyle w:val="1275"/>
+                <w:rStyle w:val="1278"/>
                 <w:highlight w:val="none"/>
                 <w:lang w:val="fr-CH" w:bidi="fr-CH"/>
               </w:rPr>
@@ -1420,7 +1386,7 @@
             </w:r>
             <w:r>
               <w:rPr>
-                <w:rStyle w:val="1275"/>
+                <w:rStyle w:val="1278"/>
                 <w:highlight w:val="none"/>
                 <w:lang w:val="fr-CH"/>
               </w:rPr>
@@ -1439,7 +1405,6 @@
           <w:r>
             <w:rPr>
               <w:highlight w:val="none"/>
-              <w:lang w:val="fr-CH"/>
             </w:rPr>
           </w:r>
           <w:r>
@@ -1450,7 +1415,7 @@
         </w:p>
         <w:p>
           <w:pPr>
-            <w:pStyle w:val="1277"/>
+            <w:pStyle w:val="1280"/>
             <w:pBdr/>
             <w:tabs>
               <w:tab w:val="right" w:leader="dot" w:pos="9071"/>
@@ -1463,12 +1428,12 @@
           <w:hyperlink w:tooltip="#_Toc9" w:anchor="_Toc9" w:history="1">
             <w:r>
               <w:rPr>
-                <w:rStyle w:val="1275"/>
+                <w:rStyle w:val="1278"/>
               </w:rPr>
             </w:r>
             <w:r>
               <w:rPr>
-                <w:rStyle w:val="1275"/>
+                <w:rStyle w:val="1278"/>
                 <w:highlight w:val="none"/>
                 <w:lang w:val="fr-CH"/>
               </w:rPr>
@@ -1476,20 +1441,20 @@
             </w:r>
             <w:r>
               <w:rPr>
-                <w:rStyle w:val="1275"/>
+                <w:rStyle w:val="1278"/>
                 <w:lang w:val="fr-CH"/>
               </w:rPr>
               <w:t xml:space="preserve">S</w:t>
             </w:r>
             <w:r>
               <w:rPr>
-                <w:rStyle w:val="1275"/>
+                <w:rStyle w:val="1278"/>
               </w:rPr>
               <w:t xml:space="preserve">éparation asynchrone (Task.Run) </w:t>
             </w:r>
             <w:r>
               <w:rPr>
-                <w:rStyle w:val="1275"/>
+                <w:rStyle w:val="1278"/>
               </w:rPr>
             </w:r>
             <w:r>
@@ -1498,6 +1463,57 @@
             <w:r>
               <w:fldChar w:fldCharType="begin"/>
               <w:instrText xml:space="preserve">PAGEREF _Toc9 \h</w:instrText>
+              <w:fldChar w:fldCharType="separate"/>
+              <w:t xml:space="preserve">5</w:t>
+              <w:fldChar w:fldCharType="end"/>
+            </w:r>
+          </w:hyperlink>
+          <w:r/>
+          <w:r/>
+        </w:p>
+        <w:p>
+          <w:pPr>
+            <w:pStyle w:val="1280"/>
+            <w:pBdr/>
+            <w:tabs>
+              <w:tab w:val="right" w:leader="dot" w:pos="9071"/>
+            </w:tabs>
+            <w:spacing/>
+            <w:ind/>
+            <w:rPr/>
+          </w:pPr>
+          <w:r/>
+          <w:hyperlink w:tooltip="#_Toc10" w:anchor="_Toc10" w:history="1">
+            <w:r>
+              <w:rPr>
+                <w:rStyle w:val="1278"/>
+              </w:rPr>
+            </w:r>
+            <w:r>
+              <w:rPr>
+                <w:rStyle w:val="1278"/>
+                <w:highlight w:val="none"/>
+                <w:lang w:val="fr-CH"/>
+              </w:rPr>
+              <w:t xml:space="preserve">4.3 </w:t>
+            </w:r>
+            <w:r>
+              <w:rPr>
+                <w:rStyle w:val="1278"/>
+              </w:rPr>
+              <w:t xml:space="preserve">Stratégie et Choix du Format d'Exportation</w:t>
+            </w:r>
+            <w:r>
+              <w:rPr>
+                <w:rStyle w:val="1278"/>
+              </w:rPr>
+            </w:r>
+            <w:r>
+              <w:tab/>
+            </w:r>
+            <w:r>
+              <w:fldChar w:fldCharType="begin"/>
+              <w:instrText xml:space="preserve">PAGEREF _Toc10 \h</w:instrText>
               <w:fldChar w:fldCharType="separate"/>
               <w:t xml:space="preserve">5</w:t>
               <w:fldChar w:fldCharType="end"/>
@@ -1518,66 +1534,15 @@
             <w:rPr/>
           </w:pPr>
           <w:r/>
-          <w:hyperlink w:tooltip="#_Toc10" w:anchor="_Toc10" w:history="1">
+          <w:hyperlink w:tooltip="#_Toc11" w:anchor="_Toc11" w:history="1">
             <w:r>
               <w:rPr>
-                <w:rStyle w:val="1275"/>
+                <w:rStyle w:val="1278"/>
               </w:rPr>
             </w:r>
             <w:r>
               <w:rPr>
-                <w:rStyle w:val="1275"/>
-                <w:highlight w:val="none"/>
-                <w:lang w:val="fr-CH"/>
-              </w:rPr>
-              <w:t xml:space="preserve">4.3 </w:t>
-            </w:r>
-            <w:r>
-              <w:rPr>
-                <w:rStyle w:val="1275"/>
-              </w:rPr>
-              <w:t xml:space="preserve">Stratégie et Choix du Format d'Exportation</w:t>
-            </w:r>
-            <w:r>
-              <w:rPr>
-                <w:rStyle w:val="1275"/>
-              </w:rPr>
-            </w:r>
-            <w:r>
-              <w:tab/>
-            </w:r>
-            <w:r>
-              <w:fldChar w:fldCharType="begin"/>
-              <w:instrText xml:space="preserve">PAGEREF _Toc10 \h</w:instrText>
-              <w:fldChar w:fldCharType="separate"/>
-              <w:t xml:space="preserve">5</w:t>
-              <w:fldChar w:fldCharType="end"/>
-            </w:r>
-          </w:hyperlink>
-          <w:r/>
-          <w:r/>
-        </w:p>
-        <w:p>
-          <w:pPr>
-            <w:pStyle w:val="1274"/>
-            <w:pBdr/>
-            <w:tabs>
-              <w:tab w:val="right" w:leader="dot" w:pos="9071"/>
-            </w:tabs>
-            <w:spacing/>
-            <w:ind/>
-            <w:rPr/>
-          </w:pPr>
-          <w:r/>
-          <w:hyperlink w:tooltip="#_Toc11" w:anchor="_Toc11" w:history="1">
-            <w:r>
-              <w:rPr>
-                <w:rStyle w:val="1275"/>
-              </w:rPr>
-            </w:r>
-            <w:r>
-              <w:rPr>
-                <w:rStyle w:val="1275"/>
+                <w:rStyle w:val="1278"/>
                 <w:highlight w:val="none"/>
                 <w:lang w:val="fr-CH"/>
               </w:rPr>
@@ -1585,13 +1550,13 @@
             </w:r>
             <w:r>
               <w:rPr>
-                <w:rStyle w:val="1275"/>
+                <w:rStyle w:val="1278"/>
               </w:rPr>
               <w:t xml:space="preserve">Limitations et Compromis assumés</w:t>
             </w:r>
             <w:r>
               <w:rPr>
-                <w:rStyle w:val="1275"/>
+                <w:rStyle w:val="1278"/>
               </w:rPr>
             </w:r>
             <w:r>
@@ -1610,7 +1575,7 @@
         </w:p>
         <w:p>
           <w:pPr>
-            <w:pStyle w:val="1274"/>
+            <w:pStyle w:val="1277"/>
             <w:pBdr/>
             <w:tabs>
               <w:tab w:val="right" w:leader="dot" w:pos="9071"/>
@@ -1623,12 +1588,12 @@
           <w:hyperlink w:tooltip="#_Toc12" w:anchor="_Toc12" w:history="1">
             <w:r>
               <w:rPr>
-                <w:rStyle w:val="1275"/>
+                <w:rStyle w:val="1278"/>
               </w:rPr>
             </w:r>
             <w:r>
               <w:rPr>
-                <w:rStyle w:val="1275"/>
+                <w:rStyle w:val="1278"/>
                 <w:highlight w:val="none"/>
                 <w:lang w:val="fr-CH"/>
               </w:rPr>
@@ -1636,7 +1601,7 @@
             </w:r>
             <w:r>
               <w:rPr>
-                <w:rStyle w:val="1275"/>
+                <w:rStyle w:val="1278"/>
               </w:rPr>
             </w:r>
             <w:r>
@@ -1655,7 +1620,7 @@
         </w:p>
         <w:p>
           <w:pPr>
-            <w:pStyle w:val="1274"/>
+            <w:pStyle w:val="1277"/>
             <w:pBdr/>
             <w:tabs>
               <w:tab w:val="right" w:leader="dot" w:pos="9071"/>
@@ -1668,12 +1633,12 @@
           <w:hyperlink w:tooltip="#_Toc13" w:anchor="_Toc13" w:history="1">
             <w:r>
               <w:rPr>
-                <w:rStyle w:val="1275"/>
+                <w:rStyle w:val="1278"/>
               </w:rPr>
             </w:r>
             <w:r>
               <w:rPr>
-                <w:rStyle w:val="1275"/>
+                <w:rStyle w:val="1278"/>
                 <w:highlight w:val="none"/>
                 <w:lang w:val="fr-CH"/>
               </w:rPr>
@@ -1681,7 +1646,7 @@
             </w:r>
             <w:r>
               <w:rPr>
-                <w:rStyle w:val="1275"/>
+                <w:rStyle w:val="1278"/>
               </w:rPr>
             </w:r>
             <w:r>
@@ -1725,6 +1690,11 @@
               <w:lang w:val="fr-FR"/>
             </w:rPr>
           </w:r>
+          <w:r>
+            <w:rPr>
+              <w:lang w:val="fr-FR"/>
+            </w:rPr>
+          </w:r>
         </w:p>
       </w:sdtContent>
     </w:sdt>
@@ -1765,7 +1735,7 @@
     </w:p>
     <w:p>
       <w:pPr>
-        <w:pStyle w:val="1077"/>
+        <w:pStyle w:val="1080"/>
         <w:pBdr/>
         <w:spacing/>
         <w:ind/>
@@ -1806,7 +1776,7 @@
     </w:p>
     <w:p>
       <w:pPr>
-        <w:pStyle w:val="1278"/>
+        <w:pStyle w:val="1281"/>
         <w:numPr>
           <w:ilvl w:val="0"/>
           <w:numId w:val="116"/>
@@ -1827,7 +1797,7 @@
     </w:p>
     <w:p>
       <w:pPr>
-        <w:pStyle w:val="1278"/>
+        <w:pStyle w:val="1281"/>
         <w:numPr>
           <w:ilvl w:val="0"/>
           <w:numId w:val="116"/>
@@ -1847,14 +1817,13 @@
     </w:p>
     <w:p>
       <w:pPr>
-        <w:pStyle w:val="1077"/>
+        <w:pStyle w:val="1080"/>
         <w:pBdr/>
         <w:spacing/>
         <w:ind/>
         <w:rPr/>
       </w:pPr>
       <w:r/>
-      <w:bookmarkStart w:id="2" w:name="_Toc2"/>
       <w:r>
         <w:rPr>
           <w:highlight w:val="none"/>
@@ -1862,11 +1831,9 @@
         </w:rPr>
         <w:t xml:space="preserve">2. </w:t>
       </w:r>
-      <w:r/>
       <w:r>
         <w:t xml:space="preserve">Problématique : Pourquoi ne pas stocker et lire le PDF nativement ?</w:t>
       </w:r>
-      <w:r/>
       <w:r/>
     </w:p>
     <w:p>
@@ -1888,7 +1855,7 @@
     </w:p>
     <w:p>
       <w:pPr>
-        <w:pStyle w:val="1278"/>
+        <w:pStyle w:val="1281"/>
         <w:numPr>
           <w:ilvl w:val="0"/>
           <w:numId w:val="126"/>
@@ -1911,7 +1878,7 @@
     </w:p>
     <w:p>
       <w:pPr>
-        <w:pStyle w:val="1278"/>
+        <w:pStyle w:val="1281"/>
         <w:numPr>
           <w:ilvl w:val="0"/>
           <w:numId w:val="126"/>
@@ -1934,7 +1901,7 @@
     </w:p>
     <w:p>
       <w:pPr>
-        <w:pStyle w:val="1278"/>
+        <w:pStyle w:val="1281"/>
         <w:numPr>
           <w:ilvl w:val="0"/>
           <w:numId w:val="126"/>
@@ -1983,7 +1950,7 @@
     </w:p>
     <w:p>
       <w:pPr>
-        <w:pStyle w:val="1077"/>
+        <w:pStyle w:val="1080"/>
         <w:pBdr/>
         <w:spacing/>
         <w:ind/>
@@ -2006,7 +1973,7 @@
     </w:p>
     <w:p>
       <w:pPr>
-        <w:pStyle w:val="1078"/>
+        <w:pStyle w:val="1081"/>
         <w:pBdr/>
         <w:spacing/>
         <w:ind/>
@@ -2052,7 +2019,7 @@
     </w:p>
     <w:p>
       <w:pPr>
-        <w:pStyle w:val="1278"/>
+        <w:pStyle w:val="1281"/>
         <w:numPr>
           <w:ilvl w:val="0"/>
           <w:numId w:val="118"/>
@@ -2086,7 +2053,7 @@
     </w:p>
     <w:p>
       <w:pPr>
-        <w:pStyle w:val="1278"/>
+        <w:pStyle w:val="1281"/>
         <w:numPr>
           <w:ilvl w:val="0"/>
           <w:numId w:val="118"/>
@@ -2120,7 +2087,7 @@
     </w:p>
     <w:p>
       <w:pPr>
-        <w:pStyle w:val="1278"/>
+        <w:pStyle w:val="1281"/>
         <w:numPr>
           <w:ilvl w:val="0"/>
           <w:numId w:val="118"/>
@@ -2154,7 +2121,7 @@
     </w:p>
     <w:p>
       <w:pPr>
-        <w:pStyle w:val="1278"/>
+        <w:pStyle w:val="1281"/>
         <w:numPr>
           <w:ilvl w:val="0"/>
           <w:numId w:val="118"/>
@@ -2188,7 +2155,7 @@
     </w:p>
     <w:p>
       <w:pPr>
-        <w:pStyle w:val="1278"/>
+        <w:pStyle w:val="1281"/>
         <w:numPr>
           <w:ilvl w:val="0"/>
           <w:numId w:val="118"/>
@@ -2216,7 +2183,7 @@
     </w:p>
     <w:p>
       <w:pPr>
-        <w:pStyle w:val="1078"/>
+        <w:pStyle w:val="1081"/>
         <w:pBdr/>
         <w:spacing/>
         <w:ind/>
@@ -2262,7 +2229,7 @@
     </w:p>
     <w:p>
       <w:pPr>
-        <w:pStyle w:val="1278"/>
+        <w:pStyle w:val="1281"/>
         <w:numPr>
           <w:ilvl w:val="0"/>
           <w:numId w:val="119"/>
@@ -2296,7 +2263,7 @@
     </w:p>
     <w:p>
       <w:pPr>
-        <w:pStyle w:val="1278"/>
+        <w:pStyle w:val="1281"/>
         <w:numPr>
           <w:ilvl w:val="0"/>
           <w:numId w:val="119"/>
@@ -2330,7 +2297,7 @@
     </w:p>
     <w:p>
       <w:pPr>
-        <w:pStyle w:val="1278"/>
+        <w:pStyle w:val="1281"/>
         <w:numPr>
           <w:ilvl w:val="0"/>
           <w:numId w:val="119"/>
@@ -2358,7 +2325,7 @@
     </w:p>
     <w:p>
       <w:pPr>
-        <w:pStyle w:val="1078"/>
+        <w:pStyle w:val="1081"/>
         <w:pBdr/>
         <w:spacing/>
         <w:ind/>
@@ -2393,7 +2360,7 @@
     </w:p>
     <w:p>
       <w:pPr>
-        <w:pStyle w:val="1278"/>
+        <w:pStyle w:val="1281"/>
         <w:numPr>
           <w:ilvl w:val="0"/>
           <w:numId w:val="122"/>
@@ -2413,7 +2380,7 @@
     </w:p>
     <w:p>
       <w:pPr>
-        <w:pStyle w:val="1278"/>
+        <w:pStyle w:val="1281"/>
         <w:numPr>
           <w:ilvl w:val="0"/>
           <w:numId w:val="122"/>
@@ -2433,7 +2400,7 @@
     </w:p>
     <w:p>
       <w:pPr>
-        <w:pStyle w:val="1278"/>
+        <w:pStyle w:val="1281"/>
         <w:numPr>
           <w:ilvl w:val="0"/>
           <w:numId w:val="122"/>
@@ -2453,7 +2420,7 @@
     </w:p>
     <w:p>
       <w:pPr>
-        <w:pStyle w:val="1077"/>
+        <w:pStyle w:val="1080"/>
         <w:pBdr/>
         <w:spacing/>
         <w:ind/>
@@ -2477,7 +2444,7 @@
     </w:p>
     <w:p>
       <w:pPr>
-        <w:pStyle w:val="1078"/>
+        <w:pStyle w:val="1081"/>
         <w:pBdr/>
         <w:spacing/>
         <w:ind/>
@@ -2501,6 +2468,7 @@
         <w:rPr>
           <w:highlight w:val="none"/>
           <w:lang w:val="fr-CH"/>
+          <w14:ligatures w14:val="none"/>
         </w:rPr>
       </w:r>
       <w:r>
@@ -2619,7 +2587,7 @@
     </w:p>
     <w:p>
       <w:pPr>
-        <w:pStyle w:val="1078"/>
+        <w:pStyle w:val="1081"/>
         <w:pBdr/>
         <w:spacing/>
         <w:ind/>
@@ -2671,7 +2639,7 @@
     </w:p>
     <w:p>
       <w:pPr>
-        <w:pStyle w:val="1278"/>
+        <w:pStyle w:val="1281"/>
         <w:numPr>
           <w:ilvl w:val="0"/>
           <w:numId w:val="120"/>
@@ -2705,7 +2673,7 @@
     </w:p>
     <w:p>
       <w:pPr>
-        <w:pStyle w:val="1278"/>
+        <w:pStyle w:val="1281"/>
         <w:numPr>
           <w:ilvl w:val="0"/>
           <w:numId w:val="120"/>
@@ -2747,7 +2715,7 @@
     </w:p>
     <w:p>
       <w:pPr>
-        <w:pStyle w:val="1078"/>
+        <w:pStyle w:val="1081"/>
         <w:pBdr/>
         <w:spacing/>
         <w:ind/>
@@ -2791,7 +2759,7 @@
     </w:p>
     <w:p>
       <w:pPr>
-        <w:pStyle w:val="1278"/>
+        <w:pStyle w:val="1281"/>
         <w:numPr>
           <w:ilvl w:val="0"/>
           <w:numId w:val="123"/>
@@ -2814,7 +2782,7 @@
     </w:p>
     <w:p>
       <w:pPr>
-        <w:pStyle w:val="1278"/>
+        <w:pStyle w:val="1281"/>
         <w:numPr>
           <w:ilvl w:val="0"/>
           <w:numId w:val="123"/>
@@ -2881,7 +2849,7 @@
     </w:p>
     <w:p>
       <w:pPr>
-        <w:pStyle w:val="1077"/>
+        <w:pStyle w:val="1080"/>
         <w:pBdr/>
         <w:spacing/>
         <w:ind/>
@@ -2927,7 +2895,7 @@
     </w:p>
     <w:p>
       <w:pPr>
-        <w:pStyle w:val="1278"/>
+        <w:pStyle w:val="1281"/>
         <w:numPr>
           <w:ilvl w:val="0"/>
           <w:numId w:val="121"/>
@@ -2955,7 +2923,7 @@
     </w:p>
     <w:p>
       <w:pPr>
-        <w:pStyle w:val="1278"/>
+        <w:pStyle w:val="1281"/>
         <w:numPr>
           <w:ilvl w:val="0"/>
           <w:numId w:val="121"/>
@@ -3057,7 +3025,7 @@
     </w:p>
     <w:p>
       <w:pPr>
-        <w:pStyle w:val="1077"/>
+        <w:pStyle w:val="1080"/>
         <w:pBdr/>
         <w:spacing/>
         <w:ind/>
@@ -3099,10 +3067,16 @@
           <w:lang w:val="fr-CH"/>
         </w:rPr>
       </w:r>
+      <w:r>
+        <w:rPr>
+          <w:highlight w:val="none"/>
+          <w:lang w:val="fr-CH"/>
+        </w:rPr>
+      </w:r>
     </w:p>
     <w:p>
       <w:pPr>
-        <w:pStyle w:val="1278"/>
+        <w:pStyle w:val="1281"/>
         <w:numPr>
           <w:ilvl w:val="0"/>
           <w:numId w:val="124"/>
@@ -3129,7 +3103,7 @@
     </w:p>
     <w:p>
       <w:pPr>
-        <w:pStyle w:val="1278"/>
+        <w:pStyle w:val="1281"/>
         <w:numPr>
           <w:ilvl w:val="0"/>
           <w:numId w:val="124"/>
@@ -3160,7 +3134,7 @@
       </w:pPr>
       <w:r>
         <w:rPr>
-          <w:rStyle w:val="1276"/>
+          <w:rStyle w:val="1279"/>
           <w:lang w:val="fr-CH"/>
         </w:rPr>
         <w:t xml:space="preserve">6.1 Résultats</w:t>
@@ -3180,7 +3154,7 @@
     </w:p>
     <w:tbl>
       <w:tblPr>
-        <w:tblStyle w:val="1213"/>
+        <w:tblStyle w:val="1216"/>
         <w:tblW w:w="0" w:type="auto"/>
         <w:tblBorders/>
         <w:tblLayout w:type="fixed"/>
@@ -3202,6 +3176,8 @@
             <w:tcBorders/>
             <w:tcW w:w="2409" w:type="dxa"/>
             <w:vMerge w:val="restart"/>
+            <w:textDirection w:val="lrTb"/>
+            <w:noWrap w:val="false"/>
           </w:tcPr>
           <w:p>
             <w:pPr>
@@ -3239,6 +3215,8 @@
           <w:tcPr>
             <w:tcBorders/>
             <w:tcW w:w="1417" w:type="dxa"/>
+            <w:textDirection w:val="lrTb"/>
+            <w:noWrap w:val="false"/>
           </w:tcPr>
           <w:p>
             <w:pPr>
@@ -3275,7 +3253,6 @@
                 <w:b/>
                 <w:bCs/>
                 <w:highlight w:val="none"/>
-                <w:lang w:val="fr-CH"/>
               </w:rPr>
             </w:r>
             <w:r>
@@ -3291,6 +3268,8 @@
           <w:tcPr>
             <w:tcBorders/>
             <w:tcW w:w="1701" w:type="dxa"/>
+            <w:textDirection w:val="lrTb"/>
+            <w:noWrap w:val="false"/>
           </w:tcPr>
           <w:p>
             <w:pPr>
@@ -3318,7 +3297,6 @@
                 <w:b/>
                 <w:bCs/>
                 <w:highlight w:val="none"/>
-                <w:lang w:val="fr-CH"/>
               </w:rPr>
             </w:r>
             <w:r>
@@ -3334,6 +3312,8 @@
           <w:tcPr>
             <w:tcBorders/>
             <w:tcW w:w="1843" w:type="dxa"/>
+            <w:textDirection w:val="lrTb"/>
+            <w:noWrap w:val="false"/>
           </w:tcPr>
           <w:p>
             <w:pPr>
@@ -3361,7 +3341,6 @@
                 <w:b/>
                 <w:bCs/>
                 <w:highlight w:val="none"/>
-                <w:lang w:val="fr-CH"/>
               </w:rPr>
             </w:r>
             <w:r>
@@ -3377,6 +3356,8 @@
           <w:tcPr>
             <w:tcBorders/>
             <w:tcW w:w="1573" w:type="dxa"/>
+            <w:textDirection w:val="lrTb"/>
+            <w:noWrap w:val="false"/>
           </w:tcPr>
           <w:p>
             <w:pPr>
@@ -3404,7 +3385,6 @@
                 <w:b/>
                 <w:bCs/>
                 <w:highlight w:val="none"/>
-                <w:lang w:val="fr-CH"/>
               </w:rPr>
             </w:r>
             <w:r>
@@ -3425,6 +3405,8 @@
           <w:tcPr>
             <w:tcBorders/>
             <w:tcW w:w="2409" w:type="dxa"/>
+            <w:textDirection w:val="lrTb"/>
+            <w:noWrap w:val="false"/>
           </w:tcPr>
           <w:p>
             <w:pPr>
@@ -3451,7 +3433,6 @@
                 <w:b/>
                 <w:bCs/>
                 <w:highlight w:val="none"/>
-                <w:lang w:val="fr-CH"/>
               </w:rPr>
             </w:r>
             <w:r>
@@ -3467,6 +3448,8 @@
           <w:tcPr>
             <w:tcBorders/>
             <w:tcW w:w="1417" w:type="dxa"/>
+            <w:textDirection w:val="lrTb"/>
+            <w:noWrap w:val="false"/>
           </w:tcPr>
           <w:p>
             <w:pPr>
@@ -3504,6 +3487,8 @@
           <w:tcPr>
             <w:tcBorders/>
             <w:tcW w:w="1701" w:type="dxa"/>
+            <w:textDirection w:val="lrTb"/>
+            <w:noWrap w:val="false"/>
           </w:tcPr>
           <w:p>
             <w:pPr>
@@ -3548,6 +3533,8 @@
           <w:tcPr>
             <w:tcBorders/>
             <w:tcW w:w="1843" w:type="dxa"/>
+            <w:textDirection w:val="lrTb"/>
+            <w:noWrap w:val="false"/>
           </w:tcPr>
           <w:p>
             <w:pPr>
@@ -3592,6 +3579,8 @@
           <w:tcPr>
             <w:tcBorders/>
             <w:tcW w:w="1573" w:type="dxa"/>
+            <w:textDirection w:val="lrTb"/>
+            <w:noWrap w:val="false"/>
           </w:tcPr>
           <w:p>
             <w:pPr>
@@ -3626,6 +3615,8 @@
           <w:tcPr>
             <w:tcBorders/>
             <w:tcW w:w="2409" w:type="dxa"/>
+            <w:textDirection w:val="lrTb"/>
+            <w:noWrap w:val="false"/>
           </w:tcPr>
           <w:p>
             <w:pPr>
@@ -3652,7 +3643,6 @@
                 <w:b/>
                 <w:bCs/>
                 <w:highlight w:val="none"/>
-                <w:lang w:val="fr-CH"/>
               </w:rPr>
             </w:r>
             <w:r>
@@ -3668,6 +3658,8 @@
           <w:tcPr>
             <w:tcBorders/>
             <w:tcW w:w="1417" w:type="dxa"/>
+            <w:textDirection w:val="lrTb"/>
+            <w:noWrap w:val="false"/>
           </w:tcPr>
           <w:p>
             <w:pPr>
@@ -3712,6 +3704,8 @@
           <w:tcPr>
             <w:tcBorders/>
             <w:tcW w:w="1701" w:type="dxa"/>
+            <w:textDirection w:val="lrTb"/>
+            <w:noWrap w:val="false"/>
           </w:tcPr>
           <w:p>
             <w:pPr>
@@ -3756,6 +3750,8 @@
           <w:tcPr>
             <w:tcBorders/>
             <w:tcW w:w="1843" w:type="dxa"/>
+            <w:textDirection w:val="lrTb"/>
+            <w:noWrap w:val="false"/>
           </w:tcPr>
           <w:p>
             <w:pPr>
@@ -3800,6 +3796,8 @@
           <w:tcPr>
             <w:tcBorders/>
             <w:tcW w:w="1573" w:type="dxa"/>
+            <w:textDirection w:val="lrTb"/>
+            <w:noWrap w:val="false"/>
           </w:tcPr>
           <w:p>
             <w:pPr>
@@ -3850,6 +3848,8 @@
             <w:tcBorders/>
             <w:tcW w:w="2409" w:type="dxa"/>
             <w:vMerge w:val="restart"/>
+            <w:textDirection w:val="lrTb"/>
+            <w:noWrap w:val="false"/>
           </w:tcPr>
           <w:p>
             <w:pPr>
@@ -3893,7 +3893,6 @@
                 <w:b/>
                 <w:bCs/>
                 <w:highlight w:val="none"/>
-                <w:lang w:val="fr-CH"/>
               </w:rPr>
             </w:r>
             <w:r>
@@ -3910,6 +3909,8 @@
             <w:tcBorders/>
             <w:tcW w:w="1417" w:type="dxa"/>
             <w:vMerge w:val="restart"/>
+            <w:textDirection w:val="lrTb"/>
+            <w:noWrap w:val="false"/>
           </w:tcPr>
           <w:p>
             <w:pPr>
@@ -3955,6 +3956,8 @@
             <w:tcBorders/>
             <w:tcW w:w="1701" w:type="dxa"/>
             <w:vMerge w:val="restart"/>
+            <w:textDirection w:val="lrTb"/>
+            <w:noWrap w:val="false"/>
           </w:tcPr>
           <w:p>
             <w:pPr>
@@ -3999,6 +4002,8 @@
           <w:tcPr>
             <w:tcBorders/>
             <w:tcW w:w="1843" w:type="dxa"/>
+            <w:textDirection w:val="lrTb"/>
+            <w:noWrap w:val="false"/>
           </w:tcPr>
           <w:p>
             <w:pPr>
@@ -4043,6 +4048,8 @@
           <w:tcPr>
             <w:tcBorders/>
             <w:tcW w:w="1573" w:type="dxa"/>
+            <w:textDirection w:val="lrTb"/>
+            <w:noWrap w:val="false"/>
           </w:tcPr>
           <w:p>
             <w:pPr>
@@ -4092,6 +4099,8 @@
           <w:tcPr>
             <w:tcBorders/>
             <w:tcW w:w="2409" w:type="dxa"/>
+            <w:textDirection w:val="lrTb"/>
+            <w:noWrap w:val="false"/>
           </w:tcPr>
           <w:p>
             <w:pPr>
@@ -4135,7 +4144,6 @@
                 <w:b/>
                 <w:bCs/>
                 <w:highlight w:val="none"/>
-                <w:lang w:val="fr-CH"/>
               </w:rPr>
             </w:r>
             <w:r>
@@ -4151,6 +4159,8 @@
           <w:tcPr>
             <w:tcBorders/>
             <w:tcW w:w="1417" w:type="dxa"/>
+            <w:textDirection w:val="lrTb"/>
+            <w:noWrap w:val="false"/>
           </w:tcPr>
           <w:p>
             <w:pPr>
@@ -4195,6 +4205,8 @@
           <w:tcPr>
             <w:tcBorders/>
             <w:tcW w:w="1701" w:type="dxa"/>
+            <w:textDirection w:val="lrTb"/>
+            <w:noWrap w:val="false"/>
           </w:tcPr>
           <w:p>
             <w:pPr>
@@ -4239,6 +4251,8 @@
           <w:tcPr>
             <w:tcBorders/>
             <w:tcW w:w="1843" w:type="dxa"/>
+            <w:textDirection w:val="lrTb"/>
+            <w:noWrap w:val="false"/>
           </w:tcPr>
           <w:p>
             <w:pPr>
@@ -4283,6 +4297,8 @@
           <w:tcPr>
             <w:tcBorders/>
             <w:tcW w:w="1573" w:type="dxa"/>
+            <w:textDirection w:val="lrTb"/>
+            <w:noWrap w:val="false"/>
           </w:tcPr>
           <w:p>
             <w:pPr>
@@ -4457,6 +4473,12 @@
           <w:lang w:val="fr-CH"/>
         </w:rPr>
       </w:r>
+      <w:r>
+        <w:rPr>
+          <w:highlight w:val="none"/>
+          <w:lang w:val="fr-CH"/>
+        </w:rPr>
+      </w:r>
     </w:p>
     <w:p>
       <w:pPr>
@@ -4550,7 +4572,7 @@
     </w:p>
     <w:p>
       <w:pPr>
-        <w:pStyle w:val="1077"/>
+        <w:pStyle w:val="1080"/>
         <w:pBdr/>
         <w:spacing/>
         <w:ind/>
@@ -5164,7 +5186,7 @@
       <w:r>
         <w:rPr>
           <w:highlight w:val="none"/>
-          <w:lang w:val="fr-CH"/>
+          <w:lang w:val="fr-CH" w:bidi="fr-CH"/>
         </w:rPr>
       </w:r>
       <w:r>
@@ -5193,7 +5215,7 @@
       <w:r>
         <w:rPr>
           <w:highlight w:val="none"/>
-          <w:lang w:val="fr-CH" w:bidi="fr-CH"/>
+          <w:lang w:val="fr-CH"/>
         </w:rPr>
       </w:r>
       <w:r>
@@ -5332,7 +5354,7 @@
         <w:sdtContent>
           <w:p>
             <w:pPr>
-              <w:pStyle w:val="1268"/>
+              <w:pStyle w:val="1271"/>
               <w:pBdr>
                 <w:bottom w:val="single" w:color="000000" w:sz="6" w:space="0"/>
               </w:pBdr>
@@ -5353,7 +5375,7 @@
           </w:p>
           <w:p>
             <w:pPr>
-              <w:pStyle w:val="1268"/>
+              <w:pStyle w:val="1271"/>
               <w:pBdr/>
               <w:spacing/>
               <w:ind/>
@@ -5573,7 +5595,7 @@
                 <w:szCs w:val="22"/>
                 <w:lang w:val="fr-CH"/>
               </w:rPr>
-              <w:t xml:space="preserve">28.04.26</w:t>
+              <w:t xml:space="preserve">20.05.26</w:t>
             </w:r>
             <w:r>
               <w:rPr>
@@ -5703,7 +5725,7 @@
 <w:hdr xmlns:wpc="http://schemas.microsoft.com/office/word/2010/wordprocessingCanvas" xmlns:mc="http://schemas.openxmlformats.org/markup-compatibility/2006" xmlns:o="urn:schemas-microsoft-com:office:office" xmlns:r="http://schemas.openxmlformats.org/officeDocument/2006/relationships" xmlns:m="http://schemas.openxmlformats.org/officeDocument/2006/math" xmlns:v="urn:schemas-microsoft-com:vml" xmlns:wp14="http://schemas.microsoft.com/office/word/2010/wordprocessingDrawing" xmlns:wp="http://schemas.openxmlformats.org/drawingml/2006/wordprocessingDrawing" xmlns:w10="urn:schemas-microsoft-com:office:word" xmlns:w="http://schemas.openxmlformats.org/wordprocessingml/2006/main" xmlns:w14="http://schemas.microsoft.com/office/word/2010/wordml" xmlns:w15="http://schemas.microsoft.com/office/word/2012/wordml" xmlns:wpg="http://schemas.microsoft.com/office/word/2010/wordprocessingGroup" xmlns:wpi="http://schemas.microsoft.com/office/word/2010/wordprocessingInk" xmlns:wne="http://schemas.microsoft.com/office/word/2006/wordml" xmlns:a="http://schemas.openxmlformats.org/drawingml/2006/main" xmlns:wps="http://schemas.microsoft.com/office/word/2010/wordprocessingShape" mc:Ignorable="w14 w15 wp14">
   <w:p>
     <w:pPr>
-      <w:pStyle w:val="1266"/>
+      <w:pStyle w:val="1269"/>
       <w:pBdr>
         <w:bottom w:val="single" w:color="000000" w:sz="6" w:space="0"/>
       </w:pBdr>
@@ -23331,7 +23353,7 @@
     <w:lsdException w:name="Bibliography" w:uiPriority="37"/>
     <w:lsdException w:name="TOC Heading" w:uiPriority="39" w:qFormat="1"/>
   </w:latentStyles>
-  <w:style w:type="paragraph" w:styleId="1076" w:default="1">
+  <w:style w:type="paragraph" w:styleId="1079" w:default="1">
     <w:name w:val="Normal"/>
     <w:qFormat/>
     <w:pPr>
@@ -23343,11 +23365,11 @@
       <w:lang w:val="fr-FR"/>
     </w:rPr>
   </w:style>
-  <w:style w:type="paragraph" w:styleId="1077">
+  <w:style w:type="paragraph" w:styleId="1080">
     <w:name w:val="Heading 1"/>
-    <w:basedOn w:val="1076"/>
-    <w:next w:val="1076"/>
-    <w:link w:val="1270"/>
+    <w:basedOn w:val="1079"/>
+    <w:next w:val="1079"/>
+    <w:link w:val="1273"/>
     <w:uiPriority w:val="9"/>
     <w:qFormat/>
     <w:pPr>
@@ -23365,11 +23387,11 @@
       <w:szCs w:val="32"/>
     </w:rPr>
   </w:style>
-  <w:style w:type="paragraph" w:styleId="1078">
+  <w:style w:type="paragraph" w:styleId="1081">
     <w:name w:val="Heading 2"/>
-    <w:basedOn w:val="1076"/>
-    <w:next w:val="1076"/>
-    <w:link w:val="1276"/>
+    <w:basedOn w:val="1079"/>
+    <w:next w:val="1079"/>
+    <w:link w:val="1279"/>
     <w:uiPriority w:val="9"/>
     <w:unhideWhenUsed/>
     <w:qFormat/>
@@ -23388,11 +23410,11 @@
       <w:szCs w:val="26"/>
     </w:rPr>
   </w:style>
-  <w:style w:type="paragraph" w:styleId="1079">
+  <w:style w:type="paragraph" w:styleId="1082">
     <w:name w:val="Heading 3"/>
-    <w:basedOn w:val="1076"/>
-    <w:next w:val="1076"/>
-    <w:link w:val="1288"/>
+    <w:basedOn w:val="1079"/>
+    <w:next w:val="1079"/>
+    <w:link w:val="1291"/>
     <w:uiPriority w:val="9"/>
     <w:unhideWhenUsed/>
     <w:qFormat/>
@@ -23411,11 +23433,11 @@
       <w:szCs w:val="24"/>
     </w:rPr>
   </w:style>
-  <w:style w:type="paragraph" w:styleId="1080">
+  <w:style w:type="paragraph" w:styleId="1083">
     <w:name w:val="Heading 4"/>
-    <w:basedOn w:val="1076"/>
-    <w:next w:val="1076"/>
-    <w:link w:val="1229"/>
+    <w:basedOn w:val="1079"/>
+    <w:next w:val="1079"/>
+    <w:link w:val="1232"/>
     <w:uiPriority w:val="9"/>
     <w:unhideWhenUsed/>
     <w:qFormat/>
@@ -23434,11 +23456,11 @@
       <w:color w:val="2f5496" w:themeColor="accent1" w:themeShade="BF"/>
     </w:rPr>
   </w:style>
-  <w:style w:type="paragraph" w:styleId="1081">
+  <w:style w:type="paragraph" w:styleId="1084">
     <w:name w:val="Heading 5"/>
-    <w:basedOn w:val="1076"/>
-    <w:next w:val="1076"/>
-    <w:link w:val="1230"/>
+    <w:basedOn w:val="1079"/>
+    <w:next w:val="1079"/>
+    <w:link w:val="1233"/>
     <w:uiPriority w:val="9"/>
     <w:unhideWhenUsed/>
     <w:qFormat/>
@@ -23455,11 +23477,11 @@
       <w:color w:val="2f5496" w:themeColor="accent1" w:themeShade="BF"/>
     </w:rPr>
   </w:style>
-  <w:style w:type="paragraph" w:styleId="1082">
+  <w:style w:type="paragraph" w:styleId="1085">
     <w:name w:val="Heading 6"/>
-    <w:basedOn w:val="1076"/>
-    <w:next w:val="1076"/>
-    <w:link w:val="1231"/>
+    <w:basedOn w:val="1079"/>
+    <w:next w:val="1079"/>
+    <w:link w:val="1234"/>
     <w:uiPriority w:val="9"/>
     <w:unhideWhenUsed/>
     <w:qFormat/>
@@ -23478,11 +23500,11 @@
       <w:color w:val="595959" w:themeColor="text1" w:themeTint="A6"/>
     </w:rPr>
   </w:style>
-  <w:style w:type="paragraph" w:styleId="1083">
+  <w:style w:type="paragraph" w:styleId="1086">
     <w:name w:val="Heading 7"/>
-    <w:basedOn w:val="1076"/>
-    <w:next w:val="1076"/>
-    <w:link w:val="1232"/>
+    <w:basedOn w:val="1079"/>
+    <w:next w:val="1079"/>
+    <w:link w:val="1235"/>
     <w:uiPriority w:val="9"/>
     <w:unhideWhenUsed/>
     <w:qFormat/>
@@ -23499,11 +23521,11 @@
       <w:color w:val="595959" w:themeColor="text1" w:themeTint="A6"/>
     </w:rPr>
   </w:style>
-  <w:style w:type="paragraph" w:styleId="1084">
+  <w:style w:type="paragraph" w:styleId="1087">
     <w:name w:val="Heading 8"/>
-    <w:basedOn w:val="1076"/>
-    <w:next w:val="1076"/>
-    <w:link w:val="1233"/>
+    <w:basedOn w:val="1079"/>
+    <w:next w:val="1079"/>
+    <w:link w:val="1236"/>
     <w:uiPriority w:val="9"/>
     <w:unhideWhenUsed/>
     <w:qFormat/>
@@ -23522,11 +23544,11 @@
       <w:color w:val="272727" w:themeColor="text1" w:themeTint="D8"/>
     </w:rPr>
   </w:style>
-  <w:style w:type="paragraph" w:styleId="1085">
+  <w:style w:type="paragraph" w:styleId="1088">
     <w:name w:val="Heading 9"/>
-    <w:basedOn w:val="1076"/>
-    <w:next w:val="1076"/>
-    <w:link w:val="1234"/>
+    <w:basedOn w:val="1079"/>
+    <w:next w:val="1079"/>
+    <w:link w:val="1237"/>
     <w:uiPriority w:val="9"/>
     <w:unhideWhenUsed/>
     <w:qFormat/>
@@ -23545,7 +23567,7 @@
       <w:color w:val="272727" w:themeColor="text1" w:themeTint="D8"/>
     </w:rPr>
   </w:style>
-  <w:style w:type="character" w:styleId="1086" w:default="1">
+  <w:style w:type="character" w:styleId="1089" w:default="1">
     <w:name w:val="Default Paragraph Font"/>
     <w:uiPriority w:val="1"/>
     <w:semiHidden/>
@@ -23556,7 +23578,7 @@
       <w:ind/>
     </w:pPr>
   </w:style>
-  <w:style w:type="table" w:styleId="1087" w:default="1">
+  <w:style w:type="table" w:styleId="1090" w:default="1">
     <w:name w:val="Normal Table"/>
     <w:uiPriority w:val="99"/>
     <w:semiHidden/>
@@ -23749,7 +23771,7 @@
       </w:tcPr>
     </w:tblStylePr>
   </w:style>
-  <w:style w:type="numbering" w:styleId="1088" w:default="1">
+  <w:style w:type="numbering" w:styleId="1091" w:default="1">
     <w:name w:val="No List"/>
     <w:uiPriority w:val="99"/>
     <w:semiHidden/>
@@ -23760,9 +23782,9 @@
       <w:ind/>
     </w:pPr>
   </w:style>
-  <w:style w:type="character" w:styleId="1089">
+  <w:style w:type="character" w:styleId="1092">
     <w:name w:val="Placeholder Text"/>
-    <w:basedOn w:val="1086"/>
+    <w:basedOn w:val="1089"/>
     <w:uiPriority w:val="99"/>
     <w:semiHidden/>
     <w:pPr>
@@ -23774,9 +23796,9 @@
       <w:color w:val="666666"/>
     </w:rPr>
   </w:style>
-  <w:style w:type="character" w:styleId="1090" w:customStyle="1">
+  <w:style w:type="character" w:styleId="1093" w:customStyle="1">
     <w:name w:val="Heading 4 Char"/>
-    <w:basedOn w:val="1086"/>
+    <w:basedOn w:val="1089"/>
     <w:uiPriority w:val="9"/>
     <w:pPr>
       <w:pBdr/>
@@ -23790,9 +23812,9 @@
       <w:color w:val="2f5496" w:themeColor="accent1" w:themeShade="BF"/>
     </w:rPr>
   </w:style>
-  <w:style w:type="character" w:styleId="1091" w:customStyle="1">
+  <w:style w:type="character" w:styleId="1094" w:customStyle="1">
     <w:name w:val="Heading 5 Char"/>
-    <w:basedOn w:val="1086"/>
+    <w:basedOn w:val="1089"/>
     <w:uiPriority w:val="9"/>
     <w:pPr>
       <w:pBdr/>
@@ -23804,9 +23826,9 @@
       <w:color w:val="2f5496" w:themeColor="accent1" w:themeShade="BF"/>
     </w:rPr>
   </w:style>
-  <w:style w:type="character" w:styleId="1092" w:customStyle="1">
+  <w:style w:type="character" w:styleId="1095" w:customStyle="1">
     <w:name w:val="Heading 6 Char"/>
-    <w:basedOn w:val="1086"/>
+    <w:basedOn w:val="1089"/>
     <w:uiPriority w:val="9"/>
     <w:pPr>
       <w:pBdr/>
@@ -23820,9 +23842,9 @@
       <w:color w:val="595959" w:themeColor="text1" w:themeTint="A6"/>
     </w:rPr>
   </w:style>
-  <w:style w:type="character" w:styleId="1093" w:customStyle="1">
+  <w:style w:type="character" w:styleId="1096" w:customStyle="1">
     <w:name w:val="Heading 7 Char"/>
-    <w:basedOn w:val="1086"/>
+    <w:basedOn w:val="1089"/>
     <w:uiPriority w:val="9"/>
     <w:pPr>
       <w:pBdr/>
@@ -23834,9 +23856,9 @@
       <w:color w:val="595959" w:themeColor="text1" w:themeTint="A6"/>
     </w:rPr>
   </w:style>
-  <w:style w:type="character" w:styleId="1094" w:customStyle="1">
+  <w:style w:type="character" w:styleId="1097" w:customStyle="1">
     <w:name w:val="Heading 8 Char"/>
-    <w:basedOn w:val="1086"/>
+    <w:basedOn w:val="1089"/>
     <w:uiPriority w:val="9"/>
     <w:pPr>
       <w:pBdr/>
@@ -23850,9 +23872,9 @@
       <w:color w:val="272727" w:themeColor="text1" w:themeTint="D8"/>
     </w:rPr>
   </w:style>
-  <w:style w:type="character" w:styleId="1095" w:customStyle="1">
+  <w:style w:type="character" w:styleId="1098" w:customStyle="1">
     <w:name w:val="Heading 9 Char"/>
-    <w:basedOn w:val="1086"/>
+    <w:basedOn w:val="1089"/>
     <w:uiPriority w:val="9"/>
     <w:pPr>
       <w:pBdr/>
@@ -23866,9 +23888,9 @@
       <w:color w:val="272727" w:themeColor="text1" w:themeTint="D8"/>
     </w:rPr>
   </w:style>
-  <w:style w:type="character" w:styleId="1096" w:customStyle="1">
+  <w:style w:type="character" w:styleId="1099" w:customStyle="1">
     <w:name w:val="Title Char"/>
-    <w:basedOn w:val="1086"/>
+    <w:basedOn w:val="1089"/>
     <w:uiPriority w:val="10"/>
     <w:pPr>
       <w:pBdr/>
@@ -23882,9 +23904,9 @@
       <w:szCs w:val="56"/>
     </w:rPr>
   </w:style>
-  <w:style w:type="character" w:styleId="1097" w:customStyle="1">
+  <w:style w:type="character" w:styleId="1100" w:customStyle="1">
     <w:name w:val="Subtitle Char"/>
-    <w:basedOn w:val="1086"/>
+    <w:basedOn w:val="1089"/>
     <w:uiPriority w:val="11"/>
     <w:pPr>
       <w:pBdr/>
@@ -23898,9 +23920,9 @@
       <w:szCs w:val="28"/>
     </w:rPr>
   </w:style>
-  <w:style w:type="character" w:styleId="1098" w:customStyle="1">
+  <w:style w:type="character" w:styleId="1101" w:customStyle="1">
     <w:name w:val="Quote Char"/>
-    <w:basedOn w:val="1086"/>
+    <w:basedOn w:val="1089"/>
     <w:uiPriority w:val="29"/>
     <w:pPr>
       <w:pBdr/>
@@ -23913,9 +23935,9 @@
       <w:color w:val="404040" w:themeColor="text1" w:themeTint="BF"/>
     </w:rPr>
   </w:style>
-  <w:style w:type="character" w:styleId="1099" w:customStyle="1">
+  <w:style w:type="character" w:styleId="1102" w:customStyle="1">
     <w:name w:val="Intense Quote Char"/>
-    <w:basedOn w:val="1086"/>
+    <w:basedOn w:val="1089"/>
     <w:uiPriority w:val="30"/>
     <w:pPr>
       <w:pBdr/>
@@ -23928,9 +23950,9 @@
       <w:color w:val="2f5496" w:themeColor="accent1" w:themeShade="BF"/>
     </w:rPr>
   </w:style>
-  <w:style w:type="character" w:styleId="1100" w:customStyle="1">
+  <w:style w:type="character" w:styleId="1103" w:customStyle="1">
     <w:name w:val="Footnote Text Char"/>
-    <w:basedOn w:val="1086"/>
+    <w:basedOn w:val="1089"/>
     <w:uiPriority w:val="99"/>
     <w:semiHidden/>
     <w:pPr>
@@ -23943,9 +23965,9 @@
       <w:szCs w:val="20"/>
     </w:rPr>
   </w:style>
-  <w:style w:type="character" w:styleId="1101" w:customStyle="1">
+  <w:style w:type="character" w:styleId="1104" w:customStyle="1">
     <w:name w:val="Endnote Text Char"/>
-    <w:basedOn w:val="1086"/>
+    <w:basedOn w:val="1089"/>
     <w:uiPriority w:val="99"/>
     <w:semiHidden/>
     <w:pPr>
@@ -23958,9 +23980,9 @@
       <w:szCs w:val="20"/>
     </w:rPr>
   </w:style>
-  <w:style w:type="table" w:styleId="1102" w:customStyle="1">
+  <w:style w:type="table" w:styleId="1105" w:customStyle="1">
     <w:name w:val="Table Grid Light"/>
-    <w:basedOn w:val="1087"/>
+    <w:basedOn w:val="1090"/>
     <w:uiPriority w:val="59"/>
     <w:pPr>
       <w:pBdr/>
@@ -24150,9 +24172,9 @@
       </w:tcPr>
     </w:tblStylePr>
   </w:style>
-  <w:style w:type="table" w:styleId="1103">
+  <w:style w:type="table" w:styleId="1106">
     <w:name w:val="Plain Table 1"/>
-    <w:basedOn w:val="1087"/>
+    <w:basedOn w:val="1090"/>
     <w:uiPriority w:val="59"/>
     <w:pPr>
       <w:pBdr/>
@@ -24368,9 +24390,9 @@
       </w:tcPr>
     </w:tblStylePr>
   </w:style>
-  <w:style w:type="table" w:styleId="1104">
+  <w:style w:type="table" w:styleId="1107">
     <w:name w:val="Plain Table 2"/>
-    <w:basedOn w:val="1087"/>
+    <w:basedOn w:val="1090"/>
     <w:uiPriority w:val="59"/>
     <w:pPr>
       <w:pBdr/>
@@ -24594,9 +24616,9 @@
       </w:tcPr>
     </w:tblStylePr>
   </w:style>
-  <w:style w:type="table" w:styleId="1105">
+  <w:style w:type="table" w:styleId="1108">
     <w:name w:val="Plain Table 3"/>
-    <w:basedOn w:val="1087"/>
+    <w:basedOn w:val="1090"/>
     <w:uiPriority w:val="99"/>
     <w:pPr>
       <w:pBdr/>
@@ -24823,9 +24845,9 @@
       </w:tcPr>
     </w:tblStylePr>
   </w:style>
-  <w:style w:type="table" w:styleId="1106">
+  <w:style w:type="table" w:styleId="1109">
     <w:name w:val="Plain Table 4"/>
-    <w:basedOn w:val="1087"/>
+    <w:basedOn w:val="1090"/>
     <w:uiPriority w:val="99"/>
     <w:pPr>
       <w:pBdr/>
@@ -25038,9 +25060,9 @@
       </w:tcPr>
     </w:tblStylePr>
   </w:style>
-  <w:style w:type="table" w:styleId="1107">
+  <w:style w:type="table" w:styleId="1110">
     <w:name w:val="Plain Table 5"/>
-    <w:basedOn w:val="1087"/>
+    <w:basedOn w:val="1090"/>
     <w:uiPriority w:val="99"/>
     <w:pPr>
       <w:pBdr/>
@@ -25270,9 +25292,9 @@
       </w:tcPr>
     </w:tblStylePr>
   </w:style>
-  <w:style w:type="table" w:styleId="1108">
+  <w:style w:type="table" w:styleId="1111">
     <w:name w:val="Grid Table 1 Light"/>
-    <w:basedOn w:val="1087"/>
+    <w:basedOn w:val="1090"/>
     <w:uiPriority w:val="99"/>
     <w:pPr>
       <w:pBdr/>
@@ -25492,9 +25514,9 @@
       </w:tcPr>
     </w:tblStylePr>
   </w:style>
-  <w:style w:type="table" w:styleId="1109" w:customStyle="1">
+  <w:style w:type="table" w:styleId="1112" w:customStyle="1">
     <w:name w:val="Grid Table 1 Light - Accent 1"/>
-    <w:basedOn w:val="1087"/>
+    <w:basedOn w:val="1090"/>
     <w:uiPriority w:val="99"/>
     <w:pPr>
       <w:pBdr/>
@@ -25714,9 +25736,9 @@
       </w:tcPr>
     </w:tblStylePr>
   </w:style>
-  <w:style w:type="table" w:styleId="1110" w:customStyle="1">
+  <w:style w:type="table" w:styleId="1113" w:customStyle="1">
     <w:name w:val="Grid Table 1 Light - Accent 2"/>
-    <w:basedOn w:val="1087"/>
+    <w:basedOn w:val="1090"/>
     <w:uiPriority w:val="99"/>
     <w:pPr>
       <w:pBdr/>
@@ -25936,9 +25958,9 @@
       </w:tcPr>
     </w:tblStylePr>
   </w:style>
-  <w:style w:type="table" w:styleId="1111" w:customStyle="1">
+  <w:style w:type="table" w:styleId="1114" w:customStyle="1">
     <w:name w:val="Grid Table 1 Light - Accent 3"/>
-    <w:basedOn w:val="1087"/>
+    <w:basedOn w:val="1090"/>
     <w:uiPriority w:val="99"/>
     <w:pPr>
       <w:pBdr/>
@@ -26158,9 +26180,9 @@
       </w:tcPr>
     </w:tblStylePr>
   </w:style>
-  <w:style w:type="table" w:styleId="1112" w:customStyle="1">
+  <w:style w:type="table" w:styleId="1115" w:customStyle="1">
     <w:name w:val="Grid Table 1 Light - Accent 4"/>
-    <w:basedOn w:val="1087"/>
+    <w:basedOn w:val="1090"/>
     <w:uiPriority w:val="99"/>
     <w:pPr>
       <w:pBdr/>
@@ -26380,9 +26402,9 @@
       </w:tcPr>
     </w:tblStylePr>
   </w:style>
-  <w:style w:type="table" w:styleId="1113" w:customStyle="1">
+  <w:style w:type="table" w:styleId="1116" w:customStyle="1">
     <w:name w:val="Grid Table 1 Light - Accent 5"/>
-    <w:basedOn w:val="1087"/>
+    <w:basedOn w:val="1090"/>
     <w:uiPriority w:val="99"/>
     <w:pPr>
       <w:pBdr/>
@@ -26602,9 +26624,9 @@
       </w:tcPr>
     </w:tblStylePr>
   </w:style>
-  <w:style w:type="table" w:styleId="1114" w:customStyle="1">
+  <w:style w:type="table" w:styleId="1117" w:customStyle="1">
     <w:name w:val="Grid Table 1 Light - Accent 6"/>
-    <w:basedOn w:val="1087"/>
+    <w:basedOn w:val="1090"/>
     <w:uiPriority w:val="99"/>
     <w:pPr>
       <w:pBdr/>
@@ -26824,9 +26846,9 @@
       </w:tcPr>
     </w:tblStylePr>
   </w:style>
-  <w:style w:type="table" w:styleId="1115">
+  <w:style w:type="table" w:styleId="1118">
     <w:name w:val="Grid Table 2"/>
-    <w:basedOn w:val="1087"/>
+    <w:basedOn w:val="1090"/>
     <w:uiPriority w:val="99"/>
     <w:pPr>
       <w:pBdr/>
@@ -27055,9 +27077,9 @@
       </w:tcPr>
     </w:tblStylePr>
   </w:style>
-  <w:style w:type="table" w:styleId="1116" w:customStyle="1">
+  <w:style w:type="table" w:styleId="1119" w:customStyle="1">
     <w:name w:val="Grid Table 2 - Accent 1"/>
-    <w:basedOn w:val="1087"/>
+    <w:basedOn w:val="1090"/>
     <w:uiPriority w:val="99"/>
     <w:pPr>
       <w:pBdr/>
@@ -27286,9 +27308,9 @@
       </w:tcPr>
     </w:tblStylePr>
   </w:style>
-  <w:style w:type="table" w:styleId="1117" w:customStyle="1">
+  <w:style w:type="table" w:styleId="1120" w:customStyle="1">
     <w:name w:val="Grid Table 2 - Accent 2"/>
-    <w:basedOn w:val="1087"/>
+    <w:basedOn w:val="1090"/>
     <w:uiPriority w:val="99"/>
     <w:pPr>
       <w:pBdr/>
@@ -27517,9 +27539,9 @@
       </w:tcPr>
     </w:tblStylePr>
   </w:style>
-  <w:style w:type="table" w:styleId="1118" w:customStyle="1">
+  <w:style w:type="table" w:styleId="1121" w:customStyle="1">
     <w:name w:val="Grid Table 2 - Accent 3"/>
-    <w:basedOn w:val="1087"/>
+    <w:basedOn w:val="1090"/>
     <w:uiPriority w:val="99"/>
     <w:pPr>
       <w:pBdr/>
@@ -27748,9 +27770,9 @@
       </w:tcPr>
     </w:tblStylePr>
   </w:style>
-  <w:style w:type="table" w:styleId="1119" w:customStyle="1">
+  <w:style w:type="table" w:styleId="1122" w:customStyle="1">
     <w:name w:val="Grid Table 2 - Accent 4"/>
-    <w:basedOn w:val="1087"/>
+    <w:basedOn w:val="1090"/>
     <w:uiPriority w:val="99"/>
     <w:pPr>
       <w:pBdr/>
@@ -27979,9 +28001,9 @@
       </w:tcPr>
     </w:tblStylePr>
   </w:style>
-  <w:style w:type="table" w:styleId="1120" w:customStyle="1">
+  <w:style w:type="table" w:styleId="1123" w:customStyle="1">
     <w:name w:val="Grid Table 2 - Accent 5"/>
-    <w:basedOn w:val="1087"/>
+    <w:basedOn w:val="1090"/>
     <w:uiPriority w:val="99"/>
     <w:pPr>
       <w:pBdr/>
@@ -28210,9 +28232,9 @@
       </w:tcPr>
     </w:tblStylePr>
   </w:style>
-  <w:style w:type="table" w:styleId="1121" w:customStyle="1">
+  <w:style w:type="table" w:styleId="1124" w:customStyle="1">
     <w:name w:val="Grid Table 2 - Accent 6"/>
-    <w:basedOn w:val="1087"/>
+    <w:basedOn w:val="1090"/>
     <w:uiPriority w:val="99"/>
     <w:pPr>
       <w:pBdr/>
@@ -28441,9 +28463,9 @@
       </w:tcPr>
     </w:tblStylePr>
   </w:style>
-  <w:style w:type="table" w:styleId="1122">
+  <w:style w:type="table" w:styleId="1125">
     <w:name w:val="Grid Table 3"/>
-    <w:basedOn w:val="1087"/>
+    <w:basedOn w:val="1090"/>
     <w:uiPriority w:val="99"/>
     <w:pPr>
       <w:pBdr/>
@@ -28685,9 +28707,9 @@
       </w:tcPr>
     </w:tblStylePr>
   </w:style>
-  <w:style w:type="table" w:styleId="1123" w:customStyle="1">
+  <w:style w:type="table" w:styleId="1126" w:customStyle="1">
     <w:name w:val="Grid Table 3 - Accent 1"/>
-    <w:basedOn w:val="1087"/>
+    <w:basedOn w:val="1090"/>
     <w:uiPriority w:val="99"/>
     <w:pPr>
       <w:pBdr/>
@@ -28929,9 +28951,9 @@
       </w:tcPr>
     </w:tblStylePr>
   </w:style>
-  <w:style w:type="table" w:styleId="1124" w:customStyle="1">
+  <w:style w:type="table" w:styleId="1127" w:customStyle="1">
     <w:name w:val="Grid Table 3 - Accent 2"/>
-    <w:basedOn w:val="1087"/>
+    <w:basedOn w:val="1090"/>
     <w:uiPriority w:val="99"/>
     <w:pPr>
       <w:pBdr/>
@@ -29173,9 +29195,9 @@
       </w:tcPr>
     </w:tblStylePr>
   </w:style>
-  <w:style w:type="table" w:styleId="1125" w:customStyle="1">
+  <w:style w:type="table" w:styleId="1128" w:customStyle="1">
     <w:name w:val="Grid Table 3 - Accent 3"/>
-    <w:basedOn w:val="1087"/>
+    <w:basedOn w:val="1090"/>
     <w:uiPriority w:val="99"/>
     <w:pPr>
       <w:pBdr/>
@@ -29417,9 +29439,9 @@
       </w:tcPr>
     </w:tblStylePr>
   </w:style>
-  <w:style w:type="table" w:styleId="1126" w:customStyle="1">
+  <w:style w:type="table" w:styleId="1129" w:customStyle="1">
     <w:name w:val="Grid Table 3 - Accent 4"/>
-    <w:basedOn w:val="1087"/>
+    <w:basedOn w:val="1090"/>
     <w:uiPriority w:val="99"/>
     <w:pPr>
       <w:pBdr/>
@@ -29661,9 +29683,9 @@
       </w:tcPr>
     </w:tblStylePr>
   </w:style>
-  <w:style w:type="table" w:styleId="1127" w:customStyle="1">
+  <w:style w:type="table" w:styleId="1130" w:customStyle="1">
     <w:name w:val="Grid Table 3 - Accent 5"/>
-    <w:basedOn w:val="1087"/>
+    <w:basedOn w:val="1090"/>
     <w:uiPriority w:val="99"/>
     <w:pPr>
       <w:pBdr/>
@@ -29905,9 +29927,9 @@
       </w:tcPr>
     </w:tblStylePr>
   </w:style>
-  <w:style w:type="table" w:styleId="1128" w:customStyle="1">
+  <w:style w:type="table" w:styleId="1131" w:customStyle="1">
     <w:name w:val="Grid Table 3 - Accent 6"/>
-    <w:basedOn w:val="1087"/>
+    <w:basedOn w:val="1090"/>
     <w:uiPriority w:val="99"/>
     <w:pPr>
       <w:pBdr/>
@@ -30149,9 +30171,9 @@
       </w:tcPr>
     </w:tblStylePr>
   </w:style>
-  <w:style w:type="table" w:styleId="1129" w:customStyle="1">
+  <w:style w:type="table" w:styleId="1132" w:customStyle="1">
     <w:name w:val="Grid Table 4 - Accent 1"/>
-    <w:basedOn w:val="1087"/>
+    <w:basedOn w:val="1090"/>
     <w:uiPriority w:val="59"/>
     <w:pPr>
       <w:pBdr/>
@@ -30381,9 +30403,9 @@
       </w:tcPr>
     </w:tblStylePr>
   </w:style>
-  <w:style w:type="table" w:styleId="1130" w:customStyle="1">
+  <w:style w:type="table" w:styleId="1133" w:customStyle="1">
     <w:name w:val="Grid Table 4 - Accent 2"/>
-    <w:basedOn w:val="1087"/>
+    <w:basedOn w:val="1090"/>
     <w:uiPriority w:val="59"/>
     <w:pPr>
       <w:pBdr/>
@@ -30613,9 +30635,9 @@
       </w:tcPr>
     </w:tblStylePr>
   </w:style>
-  <w:style w:type="table" w:styleId="1131" w:customStyle="1">
+  <w:style w:type="table" w:styleId="1134" w:customStyle="1">
     <w:name w:val="Grid Table 4 - Accent 3"/>
-    <w:basedOn w:val="1087"/>
+    <w:basedOn w:val="1090"/>
     <w:uiPriority w:val="59"/>
     <w:pPr>
       <w:pBdr/>
@@ -30845,9 +30867,9 @@
       </w:tcPr>
     </w:tblStylePr>
   </w:style>
-  <w:style w:type="table" w:styleId="1132" w:customStyle="1">
+  <w:style w:type="table" w:styleId="1135" w:customStyle="1">
     <w:name w:val="Grid Table 4 - Accent 4"/>
-    <w:basedOn w:val="1087"/>
+    <w:basedOn w:val="1090"/>
     <w:uiPriority w:val="59"/>
     <w:pPr>
       <w:pBdr/>
@@ -31077,9 +31099,9 @@
       </w:tcPr>
     </w:tblStylePr>
   </w:style>
-  <w:style w:type="table" w:styleId="1133" w:customStyle="1">
+  <w:style w:type="table" w:styleId="1136" w:customStyle="1">
     <w:name w:val="Grid Table 4 - Accent 5"/>
-    <w:basedOn w:val="1087"/>
+    <w:basedOn w:val="1090"/>
     <w:uiPriority w:val="59"/>
     <w:pPr>
       <w:pBdr/>
@@ -31309,9 +31331,9 @@
       </w:tcPr>
     </w:tblStylePr>
   </w:style>
-  <w:style w:type="table" w:styleId="1134" w:customStyle="1">
+  <w:style w:type="table" w:styleId="1137" w:customStyle="1">
     <w:name w:val="Grid Table 4 - Accent 6"/>
-    <w:basedOn w:val="1087"/>
+    <w:basedOn w:val="1090"/>
     <w:uiPriority w:val="59"/>
     <w:pPr>
       <w:pBdr/>
@@ -31541,9 +31563,9 @@
       </w:tcPr>
     </w:tblStylePr>
   </w:style>
-  <w:style w:type="table" w:styleId="1135">
+  <w:style w:type="table" w:styleId="1138">
     <w:name w:val="Grid Table 5 Dark"/>
-    <w:basedOn w:val="1087"/>
+    <w:basedOn w:val="1090"/>
     <w:uiPriority w:val="99"/>
     <w:pPr>
       <w:pBdr/>
@@ -31768,9 +31790,9 @@
       </w:tcPr>
     </w:tblStylePr>
   </w:style>
-  <w:style w:type="table" w:styleId="1136" w:customStyle="1">
+  <w:style w:type="table" w:styleId="1139" w:customStyle="1">
     <w:name w:val="Grid Table 5 Dark- Accent 1"/>
-    <w:basedOn w:val="1087"/>
+    <w:basedOn w:val="1090"/>
     <w:uiPriority w:val="99"/>
     <w:pPr>
       <w:pBdr/>
@@ -31995,9 +32017,9 @@
       </w:tcPr>
     </w:tblStylePr>
   </w:style>
-  <w:style w:type="table" w:styleId="1137" w:customStyle="1">
+  <w:style w:type="table" w:styleId="1140" w:customStyle="1">
     <w:name w:val="Grid Table 5 Dark - Accent 2"/>
-    <w:basedOn w:val="1087"/>
+    <w:basedOn w:val="1090"/>
     <w:uiPriority w:val="99"/>
     <w:pPr>
       <w:pBdr/>
@@ -32222,9 +32244,9 @@
       </w:tcPr>
     </w:tblStylePr>
   </w:style>
-  <w:style w:type="table" w:styleId="1138" w:customStyle="1">
+  <w:style w:type="table" w:styleId="1141" w:customStyle="1">
     <w:name w:val="Grid Table 5 Dark - Accent 3"/>
-    <w:basedOn w:val="1087"/>
+    <w:basedOn w:val="1090"/>
     <w:uiPriority w:val="99"/>
     <w:pPr>
       <w:pBdr/>
@@ -32449,9 +32471,9 @@
       </w:tcPr>
     </w:tblStylePr>
   </w:style>
-  <w:style w:type="table" w:styleId="1139" w:customStyle="1">
+  <w:style w:type="table" w:styleId="1142" w:customStyle="1">
     <w:name w:val="Grid Table 5 Dark- Accent 4"/>
-    <w:basedOn w:val="1087"/>
+    <w:basedOn w:val="1090"/>
     <w:uiPriority w:val="99"/>
     <w:pPr>
       <w:pBdr/>
@@ -32676,9 +32698,9 @@
       </w:tcPr>
     </w:tblStylePr>
   </w:style>
-  <w:style w:type="table" w:styleId="1140" w:customStyle="1">
+  <w:style w:type="table" w:styleId="1143" w:customStyle="1">
     <w:name w:val="Grid Table 5 Dark - Accent 5"/>
-    <w:basedOn w:val="1087"/>
+    <w:basedOn w:val="1090"/>
     <w:uiPriority w:val="99"/>
     <w:pPr>
       <w:pBdr/>
@@ -32903,9 +32925,9 @@
       </w:tcPr>
     </w:tblStylePr>
   </w:style>
-  <w:style w:type="table" w:styleId="1141" w:customStyle="1">
+  <w:style w:type="table" w:styleId="1144" w:customStyle="1">
     <w:name w:val="Grid Table 5 Dark - Accent 6"/>
-    <w:basedOn w:val="1087"/>
+    <w:basedOn w:val="1090"/>
     <w:uiPriority w:val="99"/>
     <w:pPr>
       <w:pBdr/>
@@ -33130,9 +33152,9 @@
       </w:tcPr>
     </w:tblStylePr>
   </w:style>
-  <w:style w:type="table" w:styleId="1142">
+  <w:style w:type="table" w:styleId="1145">
     <w:name w:val="Grid Table 6 Colorful"/>
-    <w:basedOn w:val="1087"/>
+    <w:basedOn w:val="1090"/>
     <w:uiPriority w:val="99"/>
     <w:pPr>
       <w:pBdr/>
@@ -33354,9 +33376,9 @@
       </w:tcPr>
     </w:tblStylePr>
   </w:style>
-  <w:style w:type="table" w:styleId="1143" w:customStyle="1">
+  <w:style w:type="table" w:styleId="1146" w:customStyle="1">
     <w:name w:val="Grid Table 6 Colorful - Accent 1"/>
-    <w:basedOn w:val="1087"/>
+    <w:basedOn w:val="1090"/>
     <w:uiPriority w:val="99"/>
     <w:pPr>
       <w:pBdr/>
@@ -33578,9 +33600,9 @@
       </w:tcPr>
     </w:tblStylePr>
   </w:style>
-  <w:style w:type="table" w:styleId="1144" w:customStyle="1">
+  <w:style w:type="table" w:styleId="1147" w:customStyle="1">
     <w:name w:val="Grid Table 6 Colorful - Accent 2"/>
-    <w:basedOn w:val="1087"/>
+    <w:basedOn w:val="1090"/>
     <w:uiPriority w:val="99"/>
     <w:pPr>
       <w:pBdr/>
@@ -33802,9 +33824,9 @@
       </w:tcPr>
     </w:tblStylePr>
   </w:style>
-  <w:style w:type="table" w:styleId="1145" w:customStyle="1">
+  <w:style w:type="table" w:styleId="1148" w:customStyle="1">
     <w:name w:val="Grid Table 6 Colorful - Accent 3"/>
-    <w:basedOn w:val="1087"/>
+    <w:basedOn w:val="1090"/>
     <w:uiPriority w:val="99"/>
     <w:pPr>
       <w:pBdr/>
@@ -34026,9 +34048,9 @@
       </w:tcPr>
     </w:tblStylePr>
   </w:style>
-  <w:style w:type="table" w:styleId="1146" w:customStyle="1">
+  <w:style w:type="table" w:styleId="1149" w:customStyle="1">
     <w:name w:val="Grid Table 6 Colorful - Accent 4"/>
-    <w:basedOn w:val="1087"/>
+    <w:basedOn w:val="1090"/>
     <w:uiPriority w:val="99"/>
     <w:pPr>
       <w:pBdr/>
@@ -34250,9 +34272,9 @@
       </w:tcPr>
     </w:tblStylePr>
   </w:style>
-  <w:style w:type="table" w:styleId="1147" w:customStyle="1">
+  <w:style w:type="table" w:styleId="1150" w:customStyle="1">
     <w:name w:val="Grid Table 6 Colorful - Accent 5"/>
-    <w:basedOn w:val="1087"/>
+    <w:basedOn w:val="1090"/>
     <w:uiPriority w:val="99"/>
     <w:pPr>
       <w:pBdr/>
@@ -34474,9 +34496,9 @@
       </w:tcPr>
     </w:tblStylePr>
   </w:style>
-  <w:style w:type="table" w:styleId="1148" w:customStyle="1">
+  <w:style w:type="table" w:styleId="1151" w:customStyle="1">
     <w:name w:val="Grid Table 6 Colorful - Accent 6"/>
-    <w:basedOn w:val="1087"/>
+    <w:basedOn w:val="1090"/>
     <w:uiPriority w:val="99"/>
     <w:pPr>
       <w:pBdr/>
@@ -34698,9 +34720,9 @@
       </w:tcPr>
     </w:tblStylePr>
   </w:style>
-  <w:style w:type="table" w:styleId="1149">
+  <w:style w:type="table" w:styleId="1152">
     <w:name w:val="Grid Table 7 Colorful"/>
-    <w:basedOn w:val="1087"/>
+    <w:basedOn w:val="1090"/>
     <w:uiPriority w:val="99"/>
     <w:pPr>
       <w:pBdr/>
@@ -34951,9 +34973,9 @@
       </w:tcPr>
     </w:tblStylePr>
   </w:style>
-  <w:style w:type="table" w:styleId="1150" w:customStyle="1">
+  <w:style w:type="table" w:styleId="1153" w:customStyle="1">
     <w:name w:val="Grid Table 7 Colorful - Accent 1"/>
-    <w:basedOn w:val="1087"/>
+    <w:basedOn w:val="1090"/>
     <w:uiPriority w:val="99"/>
     <w:pPr>
       <w:pBdr/>
@@ -35204,9 +35226,9 @@
       </w:tcPr>
     </w:tblStylePr>
   </w:style>
-  <w:style w:type="table" w:styleId="1151" w:customStyle="1">
+  <w:style w:type="table" w:styleId="1154" w:customStyle="1">
     <w:name w:val="Grid Table 7 Colorful - Accent 2"/>
-    <w:basedOn w:val="1087"/>
+    <w:basedOn w:val="1090"/>
     <w:uiPriority w:val="99"/>
     <w:pPr>
       <w:pBdr/>
@@ -35457,9 +35479,9 @@
       </w:tcPr>
     </w:tblStylePr>
   </w:style>
-  <w:style w:type="table" w:styleId="1152" w:customStyle="1">
+  <w:style w:type="table" w:styleId="1155" w:customStyle="1">
     <w:name w:val="Grid Table 7 Colorful - Accent 3"/>
-    <w:basedOn w:val="1087"/>
+    <w:basedOn w:val="1090"/>
     <w:uiPriority w:val="99"/>
     <w:pPr>
       <w:pBdr/>
@@ -35710,9 +35732,9 @@
       </w:tcPr>
     </w:tblStylePr>
   </w:style>
-  <w:style w:type="table" w:styleId="1153" w:customStyle="1">
+  <w:style w:type="table" w:styleId="1156" w:customStyle="1">
     <w:name w:val="Grid Table 7 Colorful - Accent 4"/>
-    <w:basedOn w:val="1087"/>
+    <w:basedOn w:val="1090"/>
     <w:uiPriority w:val="99"/>
     <w:pPr>
       <w:pBdr/>
@@ -35963,9 +35985,9 @@
       </w:tcPr>
     </w:tblStylePr>
   </w:style>
-  <w:style w:type="table" w:styleId="1154" w:customStyle="1">
+  <w:style w:type="table" w:styleId="1157" w:customStyle="1">
     <w:name w:val="Grid Table 7 Colorful - Accent 5"/>
-    <w:basedOn w:val="1087"/>
+    <w:basedOn w:val="1090"/>
     <w:uiPriority w:val="99"/>
     <w:pPr>
       <w:pBdr/>
@@ -36216,9 +36238,9 @@
       </w:tcPr>
     </w:tblStylePr>
   </w:style>
-  <w:style w:type="table" w:styleId="1155" w:customStyle="1">
+  <w:style w:type="table" w:styleId="1158" w:customStyle="1">
     <w:name w:val="Grid Table 7 Colorful - Accent 6"/>
-    <w:basedOn w:val="1087"/>
+    <w:basedOn w:val="1090"/>
     <w:uiPriority w:val="99"/>
     <w:pPr>
       <w:pBdr/>
@@ -36469,9 +36491,9 @@
       </w:tcPr>
     </w:tblStylePr>
   </w:style>
-  <w:style w:type="table" w:styleId="1156">
+  <w:style w:type="table" w:styleId="1159">
     <w:name w:val="List Table 1 Light"/>
-    <w:basedOn w:val="1087"/>
+    <w:basedOn w:val="1090"/>
     <w:uiPriority w:val="99"/>
     <w:pPr>
       <w:pBdr/>
@@ -36684,9 +36706,9 @@
       </w:tcPr>
     </w:tblStylePr>
   </w:style>
-  <w:style w:type="table" w:styleId="1157" w:customStyle="1">
+  <w:style w:type="table" w:styleId="1160" w:customStyle="1">
     <w:name w:val="List Table 1 Light - Accent 1"/>
-    <w:basedOn w:val="1087"/>
+    <w:basedOn w:val="1090"/>
     <w:uiPriority w:val="99"/>
     <w:pPr>
       <w:pBdr/>
@@ -36899,9 +36921,9 @@
       </w:tcPr>
     </w:tblStylePr>
   </w:style>
-  <w:style w:type="table" w:styleId="1158" w:customStyle="1">
+  <w:style w:type="table" w:styleId="1161" w:customStyle="1">
     <w:name w:val="List Table 1 Light - Accent 2"/>
-    <w:basedOn w:val="1087"/>
+    <w:basedOn w:val="1090"/>
     <w:uiPriority w:val="99"/>
     <w:pPr>
       <w:pBdr/>
@@ -37114,9 +37136,9 @@
       </w:tcPr>
     </w:tblStylePr>
   </w:style>
-  <w:style w:type="table" w:styleId="1159" w:customStyle="1">
+  <w:style w:type="table" w:styleId="1162" w:customStyle="1">
     <w:name w:val="List Table 1 Light - Accent 3"/>
-    <w:basedOn w:val="1087"/>
+    <w:basedOn w:val="1090"/>
     <w:uiPriority w:val="99"/>
     <w:pPr>
       <w:pBdr/>
@@ -37329,9 +37351,9 @@
       </w:tcPr>
     </w:tblStylePr>
   </w:style>
-  <w:style w:type="table" w:styleId="1160" w:customStyle="1">
+  <w:style w:type="table" w:styleId="1163" w:customStyle="1">
     <w:name w:val="List Table 1 Light - Accent 4"/>
-    <w:basedOn w:val="1087"/>
+    <w:basedOn w:val="1090"/>
     <w:uiPriority w:val="99"/>
     <w:pPr>
       <w:pBdr/>
@@ -37544,9 +37566,9 @@
       </w:tcPr>
     </w:tblStylePr>
   </w:style>
-  <w:style w:type="table" w:styleId="1161" w:customStyle="1">
+  <w:style w:type="table" w:styleId="1164" w:customStyle="1">
     <w:name w:val="List Table 1 Light - Accent 5"/>
-    <w:basedOn w:val="1087"/>
+    <w:basedOn w:val="1090"/>
     <w:uiPriority w:val="99"/>
     <w:pPr>
       <w:pBdr/>
@@ -37759,9 +37781,9 @@
       </w:tcPr>
     </w:tblStylePr>
   </w:style>
-  <w:style w:type="table" w:styleId="1162" w:customStyle="1">
+  <w:style w:type="table" w:styleId="1165" w:customStyle="1">
     <w:name w:val="List Table 1 Light - Accent 6"/>
-    <w:basedOn w:val="1087"/>
+    <w:basedOn w:val="1090"/>
     <w:uiPriority w:val="99"/>
     <w:pPr>
       <w:pBdr/>
@@ -37974,9 +37996,9 @@
       </w:tcPr>
     </w:tblStylePr>
   </w:style>
-  <w:style w:type="table" w:styleId="1163">
+  <w:style w:type="table" w:styleId="1166">
     <w:name w:val="List Table 2"/>
-    <w:basedOn w:val="1087"/>
+    <w:basedOn w:val="1090"/>
     <w:uiPriority w:val="99"/>
     <w:pPr>
       <w:pBdr/>
@@ -38211,9 +38233,9 @@
       </w:tcPr>
     </w:tblStylePr>
   </w:style>
-  <w:style w:type="table" w:styleId="1164" w:customStyle="1">
+  <w:style w:type="table" w:styleId="1167" w:customStyle="1">
     <w:name w:val="List Table 2 - Accent 1"/>
-    <w:basedOn w:val="1087"/>
+    <w:basedOn w:val="1090"/>
     <w:uiPriority w:val="99"/>
     <w:pPr>
       <w:pBdr/>
@@ -38448,9 +38470,9 @@
       </w:tcPr>
     </w:tblStylePr>
   </w:style>
-  <w:style w:type="table" w:styleId="1165" w:customStyle="1">
+  <w:style w:type="table" w:styleId="1168" w:customStyle="1">
     <w:name w:val="List Table 2 - Accent 2"/>
-    <w:basedOn w:val="1087"/>
+    <w:basedOn w:val="1090"/>
     <w:uiPriority w:val="99"/>
     <w:pPr>
       <w:pBdr/>
@@ -38685,9 +38707,9 @@
       </w:tcPr>
     </w:tblStylePr>
   </w:style>
-  <w:style w:type="table" w:styleId="1166" w:customStyle="1">
+  <w:style w:type="table" w:styleId="1169" w:customStyle="1">
     <w:name w:val="List Table 2 - Accent 3"/>
-    <w:basedOn w:val="1087"/>
+    <w:basedOn w:val="1090"/>
     <w:uiPriority w:val="99"/>
     <w:pPr>
       <w:pBdr/>
@@ -38922,9 +38944,9 @@
       </w:tcPr>
     </w:tblStylePr>
   </w:style>
-  <w:style w:type="table" w:styleId="1167" w:customStyle="1">
+  <w:style w:type="table" w:styleId="1170" w:customStyle="1">
     <w:name w:val="List Table 2 - Accent 4"/>
-    <w:basedOn w:val="1087"/>
+    <w:basedOn w:val="1090"/>
     <w:uiPriority w:val="99"/>
     <w:pPr>
       <w:pBdr/>
@@ -39159,9 +39181,9 @@
       </w:tcPr>
     </w:tblStylePr>
   </w:style>
-  <w:style w:type="table" w:styleId="1168" w:customStyle="1">
+  <w:style w:type="table" w:styleId="1171" w:customStyle="1">
     <w:name w:val="List Table 2 - Accent 5"/>
-    <w:basedOn w:val="1087"/>
+    <w:basedOn w:val="1090"/>
     <w:uiPriority w:val="99"/>
     <w:pPr>
       <w:pBdr/>
@@ -39396,9 +39418,9 @@
       </w:tcPr>
     </w:tblStylePr>
   </w:style>
-  <w:style w:type="table" w:styleId="1169" w:customStyle="1">
+  <w:style w:type="table" w:styleId="1172" w:customStyle="1">
     <w:name w:val="List Table 2 - Accent 6"/>
-    <w:basedOn w:val="1087"/>
+    <w:basedOn w:val="1090"/>
     <w:uiPriority w:val="99"/>
     <w:pPr>
       <w:pBdr/>
@@ -39633,9 +39655,9 @@
       </w:tcPr>
     </w:tblStylePr>
   </w:style>
-  <w:style w:type="table" w:styleId="1170">
+  <w:style w:type="table" w:styleId="1173">
     <w:name w:val="List Table 3"/>
-    <w:basedOn w:val="1087"/>
+    <w:basedOn w:val="1090"/>
     <w:uiPriority w:val="99"/>
     <w:pPr>
       <w:pBdr/>
@@ -39860,9 +39882,9 @@
       </w:tcPr>
     </w:tblStylePr>
   </w:style>
-  <w:style w:type="table" w:styleId="1171" w:customStyle="1">
+  <w:style w:type="table" w:styleId="1174" w:customStyle="1">
     <w:name w:val="List Table 3 - Accent 1"/>
-    <w:basedOn w:val="1087"/>
+    <w:basedOn w:val="1090"/>
     <w:uiPriority w:val="99"/>
     <w:pPr>
       <w:pBdr/>
@@ -40087,9 +40109,9 @@
       </w:tcPr>
     </w:tblStylePr>
   </w:style>
-  <w:style w:type="table" w:styleId="1172" w:customStyle="1">
+  <w:style w:type="table" w:styleId="1175" w:customStyle="1">
     <w:name w:val="List Table 3 - Accent 2"/>
-    <w:basedOn w:val="1087"/>
+    <w:basedOn w:val="1090"/>
     <w:uiPriority w:val="99"/>
     <w:pPr>
       <w:pBdr/>
@@ -40314,9 +40336,9 @@
       </w:tcPr>
     </w:tblStylePr>
   </w:style>
-  <w:style w:type="table" w:styleId="1173" w:customStyle="1">
+  <w:style w:type="table" w:styleId="1176" w:customStyle="1">
     <w:name w:val="List Table 3 - Accent 3"/>
-    <w:basedOn w:val="1087"/>
+    <w:basedOn w:val="1090"/>
     <w:uiPriority w:val="99"/>
     <w:pPr>
       <w:pBdr/>
@@ -40541,9 +40563,9 @@
       </w:tcPr>
     </w:tblStylePr>
   </w:style>
-  <w:style w:type="table" w:styleId="1174" w:customStyle="1">
+  <w:style w:type="table" w:styleId="1177" w:customStyle="1">
     <w:name w:val="List Table 3 - Accent 4"/>
-    <w:basedOn w:val="1087"/>
+    <w:basedOn w:val="1090"/>
     <w:uiPriority w:val="99"/>
     <w:pPr>
       <w:pBdr/>
@@ -40768,9 +40790,9 @@
       </w:tcPr>
     </w:tblStylePr>
   </w:style>
-  <w:style w:type="table" w:styleId="1175" w:customStyle="1">
+  <w:style w:type="table" w:styleId="1178" w:customStyle="1">
     <w:name w:val="List Table 3 - Accent 5"/>
-    <w:basedOn w:val="1087"/>
+    <w:basedOn w:val="1090"/>
     <w:uiPriority w:val="99"/>
     <w:pPr>
       <w:pBdr/>
@@ -40995,9 +41017,9 @@
       </w:tcPr>
     </w:tblStylePr>
   </w:style>
-  <w:style w:type="table" w:styleId="1176" w:customStyle="1">
+  <w:style w:type="table" w:styleId="1179" w:customStyle="1">
     <w:name w:val="List Table 3 - Accent 6"/>
-    <w:basedOn w:val="1087"/>
+    <w:basedOn w:val="1090"/>
     <w:uiPriority w:val="99"/>
     <w:pPr>
       <w:pBdr/>
@@ -41222,9 +41244,9 @@
       </w:tcPr>
     </w:tblStylePr>
   </w:style>
-  <w:style w:type="table" w:styleId="1177">
+  <w:style w:type="table" w:styleId="1180">
     <w:name w:val="List Table 4"/>
-    <w:basedOn w:val="1087"/>
+    <w:basedOn w:val="1090"/>
     <w:uiPriority w:val="99"/>
     <w:pPr>
       <w:pBdr/>
@@ -41446,9 +41468,9 @@
       </w:tcPr>
     </w:tblStylePr>
   </w:style>
-  <w:style w:type="table" w:styleId="1178" w:customStyle="1">
+  <w:style w:type="table" w:styleId="1181" w:customStyle="1">
     <w:name w:val="List Table 4 - Accent 1"/>
-    <w:basedOn w:val="1087"/>
+    <w:basedOn w:val="1090"/>
     <w:uiPriority w:val="99"/>
     <w:pPr>
       <w:pBdr/>
@@ -41670,9 +41692,9 @@
       </w:tcPr>
     </w:tblStylePr>
   </w:style>
-  <w:style w:type="table" w:styleId="1179" w:customStyle="1">
+  <w:style w:type="table" w:styleId="1182" w:customStyle="1">
     <w:name w:val="List Table 4 - Accent 2"/>
-    <w:basedOn w:val="1087"/>
+    <w:basedOn w:val="1090"/>
     <w:uiPriority w:val="99"/>
     <w:pPr>
       <w:pBdr/>
@@ -41894,9 +41916,9 @@
       </w:tcPr>
     </w:tblStylePr>
   </w:style>
-  <w:style w:type="table" w:styleId="1180" w:customStyle="1">
+  <w:style w:type="table" w:styleId="1183" w:customStyle="1">
     <w:name w:val="List Table 4 - Accent 3"/>
-    <w:basedOn w:val="1087"/>
+    <w:basedOn w:val="1090"/>
     <w:uiPriority w:val="99"/>
     <w:pPr>
       <w:pBdr/>
@@ -42118,9 +42140,9 @@
       </w:tcPr>
     </w:tblStylePr>
   </w:style>
-  <w:style w:type="table" w:styleId="1181" w:customStyle="1">
+  <w:style w:type="table" w:styleId="1184" w:customStyle="1">
     <w:name w:val="List Table 4 - Accent 4"/>
-    <w:basedOn w:val="1087"/>
+    <w:basedOn w:val="1090"/>
     <w:uiPriority w:val="99"/>
     <w:pPr>
       <w:pBdr/>
@@ -42342,9 +42364,9 @@
       </w:tcPr>
     </w:tblStylePr>
   </w:style>
-  <w:style w:type="table" w:styleId="1182" w:customStyle="1">
+  <w:style w:type="table" w:styleId="1185" w:customStyle="1">
     <w:name w:val="List Table 4 - Accent 5"/>
-    <w:basedOn w:val="1087"/>
+    <w:basedOn w:val="1090"/>
     <w:uiPriority w:val="99"/>
     <w:pPr>
       <w:pBdr/>
@@ -42566,9 +42588,9 @@
       </w:tcPr>
     </w:tblStylePr>
   </w:style>
-  <w:style w:type="table" w:styleId="1183" w:customStyle="1">
+  <w:style w:type="table" w:styleId="1186" w:customStyle="1">
     <w:name w:val="List Table 4 - Accent 6"/>
-    <w:basedOn w:val="1087"/>
+    <w:basedOn w:val="1090"/>
     <w:uiPriority w:val="99"/>
     <w:pPr>
       <w:pBdr/>
@@ -42790,9 +42812,9 @@
       </w:tcPr>
     </w:tblStylePr>
   </w:style>
-  <w:style w:type="table" w:styleId="1184">
+  <w:style w:type="table" w:styleId="1187">
     <w:name w:val="List Table 5 Dark"/>
-    <w:basedOn w:val="1087"/>
+    <w:basedOn w:val="1090"/>
     <w:uiPriority w:val="99"/>
     <w:pPr>
       <w:pBdr/>
@@ -43026,9 +43048,9 @@
       </w:tcPr>
     </w:tblStylePr>
   </w:style>
-  <w:style w:type="table" w:styleId="1185" w:customStyle="1">
+  <w:style w:type="table" w:styleId="1188" w:customStyle="1">
     <w:name w:val="List Table 5 Dark - Accent 1"/>
-    <w:basedOn w:val="1087"/>
+    <w:basedOn w:val="1090"/>
     <w:uiPriority w:val="99"/>
     <w:pPr>
       <w:pBdr/>
@@ -43262,9 +43284,9 @@
       </w:tcPr>
     </w:tblStylePr>
   </w:style>
-  <w:style w:type="table" w:styleId="1186" w:customStyle="1">
+  <w:style w:type="table" w:styleId="1189" w:customStyle="1">
     <w:name w:val="List Table 5 Dark - Accent 2"/>
-    <w:basedOn w:val="1087"/>
+    <w:basedOn w:val="1090"/>
     <w:uiPriority w:val="99"/>
     <w:pPr>
       <w:pBdr/>
@@ -43498,9 +43520,9 @@
       </w:tcPr>
     </w:tblStylePr>
   </w:style>
-  <w:style w:type="table" w:styleId="1187" w:customStyle="1">
+  <w:style w:type="table" w:styleId="1190" w:customStyle="1">
     <w:name w:val="List Table 5 Dark - Accent 3"/>
-    <w:basedOn w:val="1087"/>
+    <w:basedOn w:val="1090"/>
     <w:uiPriority w:val="99"/>
     <w:pPr>
       <w:pBdr/>
@@ -43734,9 +43756,9 @@
       </w:tcPr>
     </w:tblStylePr>
   </w:style>
-  <w:style w:type="table" w:styleId="1188" w:customStyle="1">
+  <w:style w:type="table" w:styleId="1191" w:customStyle="1">
     <w:name w:val="List Table 5 Dark - Accent 4"/>
-    <w:basedOn w:val="1087"/>
+    <w:basedOn w:val="1090"/>
     <w:uiPriority w:val="99"/>
     <w:pPr>
       <w:pBdr/>
@@ -43970,9 +43992,9 @@
       </w:tcPr>
     </w:tblStylePr>
   </w:style>
-  <w:style w:type="table" w:styleId="1189" w:customStyle="1">
+  <w:style w:type="table" w:styleId="1192" w:customStyle="1">
     <w:name w:val="List Table 5 Dark - Accent 5"/>
-    <w:basedOn w:val="1087"/>
+    <w:basedOn w:val="1090"/>
     <w:uiPriority w:val="99"/>
     <w:pPr>
       <w:pBdr/>
@@ -44206,9 +44228,9 @@
       </w:tcPr>
     </w:tblStylePr>
   </w:style>
-  <w:style w:type="table" w:styleId="1190" w:customStyle="1">
+  <w:style w:type="table" w:styleId="1193" w:customStyle="1">
     <w:name w:val="List Table 5 Dark - Accent 6"/>
-    <w:basedOn w:val="1087"/>
+    <w:basedOn w:val="1090"/>
     <w:uiPriority w:val="99"/>
     <w:pPr>
       <w:pBdr/>
@@ -44442,9 +44464,9 @@
       </w:tcPr>
     </w:tblStylePr>
   </w:style>
-  <w:style w:type="table" w:styleId="1191">
+  <w:style w:type="table" w:styleId="1194">
     <w:name w:val="List Table 6 Colorful"/>
-    <w:basedOn w:val="1087"/>
+    <w:basedOn w:val="1090"/>
     <w:uiPriority w:val="99"/>
     <w:pPr>
       <w:pBdr/>
@@ -44664,9 +44686,9 @@
       </w:tcPr>
     </w:tblStylePr>
   </w:style>
-  <w:style w:type="table" w:styleId="1192" w:customStyle="1">
+  <w:style w:type="table" w:styleId="1195" w:customStyle="1">
     <w:name w:val="List Table 6 Colorful - Accent 1"/>
-    <w:basedOn w:val="1087"/>
+    <w:basedOn w:val="1090"/>
     <w:uiPriority w:val="99"/>
     <w:pPr>
       <w:pBdr/>
@@ -44886,9 +44908,9 @@
       </w:tcPr>
     </w:tblStylePr>
   </w:style>
-  <w:style w:type="table" w:styleId="1193" w:customStyle="1">
+  <w:style w:type="table" w:styleId="1196" w:customStyle="1">
     <w:name w:val="List Table 6 Colorful - Accent 2"/>
-    <w:basedOn w:val="1087"/>
+    <w:basedOn w:val="1090"/>
     <w:uiPriority w:val="99"/>
     <w:pPr>
       <w:pBdr/>
@@ -45108,9 +45130,9 @@
       </w:tcPr>
     </w:tblStylePr>
   </w:style>
-  <w:style w:type="table" w:styleId="1194" w:customStyle="1">
+  <w:style w:type="table" w:styleId="1197" w:customStyle="1">
     <w:name w:val="List Table 6 Colorful - Accent 3"/>
-    <w:basedOn w:val="1087"/>
+    <w:basedOn w:val="1090"/>
     <w:uiPriority w:val="99"/>
     <w:pPr>
       <w:pBdr/>
@@ -45330,9 +45352,9 @@
       </w:tcPr>
     </w:tblStylePr>
   </w:style>
-  <w:style w:type="table" w:styleId="1195" w:customStyle="1">
+  <w:style w:type="table" w:styleId="1198" w:customStyle="1">
     <w:name w:val="List Table 6 Colorful - Accent 4"/>
-    <w:basedOn w:val="1087"/>
+    <w:basedOn w:val="1090"/>
     <w:uiPriority w:val="99"/>
     <w:pPr>
       <w:pBdr/>
@@ -45552,9 +45574,9 @@
       </w:tcPr>
     </w:tblStylePr>
   </w:style>
-  <w:style w:type="table" w:styleId="1196" w:customStyle="1">
+  <w:style w:type="table" w:styleId="1199" w:customStyle="1">
     <w:name w:val="List Table 6 Colorful - Accent 5"/>
-    <w:basedOn w:val="1087"/>
+    <w:basedOn w:val="1090"/>
     <w:uiPriority w:val="99"/>
     <w:pPr>
       <w:pBdr/>
@@ -45774,9 +45796,9 @@
       </w:tcPr>
     </w:tblStylePr>
   </w:style>
-  <w:style w:type="table" w:styleId="1197" w:customStyle="1">
+  <w:style w:type="table" w:styleId="1200" w:customStyle="1">
     <w:name w:val="List Table 6 Colorful - Accent 6"/>
-    <w:basedOn w:val="1087"/>
+    <w:basedOn w:val="1090"/>
     <w:uiPriority w:val="99"/>
     <w:pPr>
       <w:pBdr/>
@@ -45996,9 +46018,9 @@
       </w:tcPr>
     </w:tblStylePr>
   </w:style>
-  <w:style w:type="table" w:styleId="1198">
+  <w:style w:type="table" w:styleId="1201">
     <w:name w:val="List Table 7 Colorful"/>
-    <w:basedOn w:val="1087"/>
+    <w:basedOn w:val="1090"/>
     <w:uiPriority w:val="99"/>
     <w:pPr>
       <w:pBdr/>
@@ -46246,9 +46268,9 @@
       </w:tcPr>
     </w:tblStylePr>
   </w:style>
-  <w:style w:type="table" w:styleId="1199" w:customStyle="1">
+  <w:style w:type="table" w:styleId="1202" w:customStyle="1">
     <w:name w:val="List Table 7 Colorful - Accent 1"/>
-    <w:basedOn w:val="1087"/>
+    <w:basedOn w:val="1090"/>
     <w:uiPriority w:val="99"/>
     <w:pPr>
       <w:pBdr/>
@@ -46496,9 +46518,9 @@
       </w:tcPr>
     </w:tblStylePr>
   </w:style>
-  <w:style w:type="table" w:styleId="1200" w:customStyle="1">
+  <w:style w:type="table" w:styleId="1203" w:customStyle="1">
     <w:name w:val="List Table 7 Colorful - Accent 2"/>
-    <w:basedOn w:val="1087"/>
+    <w:basedOn w:val="1090"/>
     <w:uiPriority w:val="99"/>
     <w:pPr>
       <w:pBdr/>
@@ -46746,9 +46768,9 @@
       </w:tcPr>
     </w:tblStylePr>
   </w:style>
-  <w:style w:type="table" w:styleId="1201" w:customStyle="1">
+  <w:style w:type="table" w:styleId="1204" w:customStyle="1">
     <w:name w:val="List Table 7 Colorful - Accent 3"/>
-    <w:basedOn w:val="1087"/>
+    <w:basedOn w:val="1090"/>
     <w:uiPriority w:val="99"/>
     <w:pPr>
       <w:pBdr/>
@@ -46996,9 +47018,9 @@
       </w:tcPr>
     </w:tblStylePr>
   </w:style>
-  <w:style w:type="table" w:styleId="1202" w:customStyle="1">
+  <w:style w:type="table" w:styleId="1205" w:customStyle="1">
     <w:name w:val="List Table 7 Colorful - Accent 4"/>
-    <w:basedOn w:val="1087"/>
+    <w:basedOn w:val="1090"/>
     <w:uiPriority w:val="99"/>
     <w:pPr>
       <w:pBdr/>
@@ -47246,9 +47268,9 @@
       </w:tcPr>
     </w:tblStylePr>
   </w:style>
-  <w:style w:type="table" w:styleId="1203" w:customStyle="1">
+  <w:style w:type="table" w:styleId="1206" w:customStyle="1">
     <w:name w:val="List Table 7 Colorful - Accent 5"/>
-    <w:basedOn w:val="1087"/>
+    <w:basedOn w:val="1090"/>
     <w:uiPriority w:val="99"/>
     <w:pPr>
       <w:pBdr/>
@@ -47496,9 +47518,9 @@
       </w:tcPr>
     </w:tblStylePr>
   </w:style>
-  <w:style w:type="table" w:styleId="1204" w:customStyle="1">
+  <w:style w:type="table" w:styleId="1207" w:customStyle="1">
     <w:name w:val="List Table 7 Colorful - Accent 6"/>
-    <w:basedOn w:val="1087"/>
+    <w:basedOn w:val="1090"/>
     <w:uiPriority w:val="99"/>
     <w:pPr>
       <w:pBdr/>
@@ -47746,9 +47768,9 @@
       </w:tcPr>
     </w:tblStylePr>
   </w:style>
-  <w:style w:type="table" w:styleId="1205" w:customStyle="1">
+  <w:style w:type="table" w:styleId="1208" w:customStyle="1">
     <w:name w:val="Lined - Accent"/>
-    <w:basedOn w:val="1087"/>
+    <w:basedOn w:val="1090"/>
     <w:uiPriority w:val="99"/>
     <w:pPr>
       <w:pBdr/>
@@ -47985,9 +48007,9 @@
       </w:tcPr>
     </w:tblStylePr>
   </w:style>
-  <w:style w:type="table" w:styleId="1206" w:customStyle="1">
+  <w:style w:type="table" w:styleId="1209" w:customStyle="1">
     <w:name w:val="Lined - Accent 1"/>
-    <w:basedOn w:val="1087"/>
+    <w:basedOn w:val="1090"/>
     <w:uiPriority w:val="99"/>
     <w:pPr>
       <w:pBdr/>
@@ -48224,9 +48246,9 @@
       </w:tcPr>
     </w:tblStylePr>
   </w:style>
-  <w:style w:type="table" w:styleId="1207" w:customStyle="1">
+  <w:style w:type="table" w:styleId="1210" w:customStyle="1">
     <w:name w:val="Lined - Accent 2"/>
-    <w:basedOn w:val="1087"/>
+    <w:basedOn w:val="1090"/>
     <w:uiPriority w:val="99"/>
     <w:pPr>
       <w:pBdr/>
@@ -48463,9 +48485,9 @@
       </w:tcPr>
     </w:tblStylePr>
   </w:style>
-  <w:style w:type="table" w:styleId="1208" w:customStyle="1">
+  <w:style w:type="table" w:styleId="1211" w:customStyle="1">
     <w:name w:val="Lined - Accent 3"/>
-    <w:basedOn w:val="1087"/>
+    <w:basedOn w:val="1090"/>
     <w:uiPriority w:val="99"/>
     <w:pPr>
       <w:pBdr/>
@@ -48702,9 +48724,9 @@
       </w:tcPr>
     </w:tblStylePr>
   </w:style>
-  <w:style w:type="table" w:styleId="1209" w:customStyle="1">
+  <w:style w:type="table" w:styleId="1212" w:customStyle="1">
     <w:name w:val="Lined - Accent 4"/>
-    <w:basedOn w:val="1087"/>
+    <w:basedOn w:val="1090"/>
     <w:uiPriority w:val="99"/>
     <w:pPr>
       <w:pBdr/>
@@ -48941,9 +48963,9 @@
       </w:tcPr>
     </w:tblStylePr>
   </w:style>
-  <w:style w:type="table" w:styleId="1210" w:customStyle="1">
+  <w:style w:type="table" w:styleId="1213" w:customStyle="1">
     <w:name w:val="Lined - Accent 5"/>
-    <w:basedOn w:val="1087"/>
+    <w:basedOn w:val="1090"/>
     <w:uiPriority w:val="99"/>
     <w:pPr>
       <w:pBdr/>
@@ -49180,9 +49202,9 @@
       </w:tcPr>
     </w:tblStylePr>
   </w:style>
-  <w:style w:type="table" w:styleId="1211" w:customStyle="1">
+  <w:style w:type="table" w:styleId="1214" w:customStyle="1">
     <w:name w:val="Lined - Accent 6"/>
-    <w:basedOn w:val="1087"/>
+    <w:basedOn w:val="1090"/>
     <w:uiPriority w:val="99"/>
     <w:pPr>
       <w:pBdr/>
@@ -49419,9 +49441,9 @@
       </w:tcPr>
     </w:tblStylePr>
   </w:style>
-  <w:style w:type="table" w:styleId="1212" w:customStyle="1">
+  <w:style w:type="table" w:styleId="1215" w:customStyle="1">
     <w:name w:val="Bordered &amp; Lined - Accent"/>
-    <w:basedOn w:val="1087"/>
+    <w:basedOn w:val="1090"/>
     <w:uiPriority w:val="99"/>
     <w:pPr>
       <w:pBdr/>
@@ -49665,9 +49687,9 @@
       </w:tcPr>
     </w:tblStylePr>
   </w:style>
-  <w:style w:type="table" w:styleId="1213" w:customStyle="1">
+  <w:style w:type="table" w:styleId="1216" w:customStyle="1">
     <w:name w:val="Bordered &amp; Lined - Accent 1"/>
-    <w:basedOn w:val="1087"/>
+    <w:basedOn w:val="1090"/>
     <w:uiPriority w:val="99"/>
     <w:pPr>
       <w:pBdr/>
@@ -49911,9 +49933,9 @@
       </w:tcPr>
     </w:tblStylePr>
   </w:style>
-  <w:style w:type="table" w:styleId="1214" w:customStyle="1">
+  <w:style w:type="table" w:styleId="1217" w:customStyle="1">
     <w:name w:val="Bordered &amp; Lined - Accent 2"/>
-    <w:basedOn w:val="1087"/>
+    <w:basedOn w:val="1090"/>
     <w:uiPriority w:val="99"/>
     <w:pPr>
       <w:pBdr/>
@@ -50157,9 +50179,9 @@
       </w:tcPr>
     </w:tblStylePr>
   </w:style>
-  <w:style w:type="table" w:styleId="1215" w:customStyle="1">
+  <w:style w:type="table" w:styleId="1218" w:customStyle="1">
     <w:name w:val="Bordered &amp; Lined - Accent 3"/>
-    <w:basedOn w:val="1087"/>
+    <w:basedOn w:val="1090"/>
     <w:uiPriority w:val="99"/>
     <w:pPr>
       <w:pBdr/>
@@ -50403,9 +50425,9 @@
       </w:tcPr>
     </w:tblStylePr>
   </w:style>
-  <w:style w:type="table" w:styleId="1216" w:customStyle="1">
+  <w:style w:type="table" w:styleId="1219" w:customStyle="1">
     <w:name w:val="Bordered &amp; Lined - Accent 4"/>
-    <w:basedOn w:val="1087"/>
+    <w:basedOn w:val="1090"/>
     <w:uiPriority w:val="99"/>
     <w:pPr>
       <w:pBdr/>
@@ -50649,9 +50671,9 @@
       </w:tcPr>
     </w:tblStylePr>
   </w:style>
-  <w:style w:type="table" w:styleId="1217" w:customStyle="1">
+  <w:style w:type="table" w:styleId="1220" w:customStyle="1">
     <w:name w:val="Bordered &amp; Lined - Accent 5"/>
-    <w:basedOn w:val="1087"/>
+    <w:basedOn w:val="1090"/>
     <w:uiPriority w:val="99"/>
     <w:pPr>
       <w:pBdr/>
@@ -50895,9 +50917,9 @@
       </w:tcPr>
     </w:tblStylePr>
   </w:style>
-  <w:style w:type="table" w:styleId="1218" w:customStyle="1">
+  <w:style w:type="table" w:styleId="1221" w:customStyle="1">
     <w:name w:val="Bordered &amp; Lined - Accent 6"/>
-    <w:basedOn w:val="1087"/>
+    <w:basedOn w:val="1090"/>
     <w:uiPriority w:val="99"/>
     <w:pPr>
       <w:pBdr/>
@@ -51141,9 +51163,9 @@
       </w:tcPr>
     </w:tblStylePr>
   </w:style>
-  <w:style w:type="table" w:styleId="1219" w:customStyle="1">
+  <w:style w:type="table" w:styleId="1222" w:customStyle="1">
     <w:name w:val="Bordered"/>
-    <w:basedOn w:val="1087"/>
+    <w:basedOn w:val="1090"/>
     <w:uiPriority w:val="99"/>
     <w:pPr>
       <w:pBdr/>
@@ -51371,9 +51393,9 @@
       </w:tcPr>
     </w:tblStylePr>
   </w:style>
-  <w:style w:type="table" w:styleId="1220" w:customStyle="1">
+  <w:style w:type="table" w:styleId="1223" w:customStyle="1">
     <w:name w:val="Bordered - Accent 1"/>
-    <w:basedOn w:val="1087"/>
+    <w:basedOn w:val="1090"/>
     <w:uiPriority w:val="99"/>
     <w:pPr>
       <w:pBdr/>
@@ -51601,9 +51623,9 @@
       </w:tcPr>
     </w:tblStylePr>
   </w:style>
-  <w:style w:type="table" w:styleId="1221" w:customStyle="1">
+  <w:style w:type="table" w:styleId="1224" w:customStyle="1">
     <w:name w:val="Bordered - Accent 2"/>
-    <w:basedOn w:val="1087"/>
+    <w:basedOn w:val="1090"/>
     <w:uiPriority w:val="99"/>
     <w:pPr>
       <w:pBdr/>
@@ -51831,9 +51853,9 @@
       </w:tcPr>
     </w:tblStylePr>
   </w:style>
-  <w:style w:type="table" w:styleId="1222" w:customStyle="1">
+  <w:style w:type="table" w:styleId="1225" w:customStyle="1">
     <w:name w:val="Bordered - Accent 3"/>
-    <w:basedOn w:val="1087"/>
+    <w:basedOn w:val="1090"/>
     <w:uiPriority w:val="99"/>
     <w:pPr>
       <w:pBdr/>
@@ -52061,9 +52083,9 @@
       </w:tcPr>
     </w:tblStylePr>
   </w:style>
-  <w:style w:type="table" w:styleId="1223" w:customStyle="1">
+  <w:style w:type="table" w:styleId="1226" w:customStyle="1">
     <w:name w:val="Bordered - Accent 4"/>
-    <w:basedOn w:val="1087"/>
+    <w:basedOn w:val="1090"/>
     <w:uiPriority w:val="99"/>
     <w:pPr>
       <w:pBdr/>
@@ -52291,9 +52313,9 @@
       </w:tcPr>
     </w:tblStylePr>
   </w:style>
-  <w:style w:type="table" w:styleId="1224" w:customStyle="1">
+  <w:style w:type="table" w:styleId="1227" w:customStyle="1">
     <w:name w:val="Bordered - Accent 5"/>
-    <w:basedOn w:val="1087"/>
+    <w:basedOn w:val="1090"/>
     <w:uiPriority w:val="99"/>
     <w:pPr>
       <w:pBdr/>
@@ -52521,9 +52543,9 @@
       </w:tcPr>
     </w:tblStylePr>
   </w:style>
-  <w:style w:type="table" w:styleId="1225" w:customStyle="1">
+  <w:style w:type="table" w:styleId="1228" w:customStyle="1">
     <w:name w:val="Bordered - Accent 6"/>
-    <w:basedOn w:val="1087"/>
+    <w:basedOn w:val="1090"/>
     <w:uiPriority w:val="99"/>
     <w:pPr>
       <w:pBdr/>
@@ -52751,9 +52773,9 @@
       </w:tcPr>
     </w:tblStylePr>
   </w:style>
-  <w:style w:type="character" w:styleId="1226" w:customStyle="1">
+  <w:style w:type="character" w:styleId="1229" w:customStyle="1">
     <w:name w:val="Heading 1 Char"/>
-    <w:basedOn w:val="1086"/>
+    <w:basedOn w:val="1089"/>
     <w:uiPriority w:val="9"/>
     <w:pPr>
       <w:pBdr/>
@@ -52767,9 +52789,9 @@
       <w:szCs w:val="40"/>
     </w:rPr>
   </w:style>
-  <w:style w:type="character" w:styleId="1227" w:customStyle="1">
+  <w:style w:type="character" w:styleId="1230" w:customStyle="1">
     <w:name w:val="Heading 2 Char"/>
-    <w:basedOn w:val="1086"/>
+    <w:basedOn w:val="1089"/>
     <w:uiPriority w:val="9"/>
     <w:pPr>
       <w:pBdr/>
@@ -52783,9 +52805,9 @@
       <w:szCs w:val="32"/>
     </w:rPr>
   </w:style>
-  <w:style w:type="character" w:styleId="1228" w:customStyle="1">
+  <w:style w:type="character" w:styleId="1231" w:customStyle="1">
     <w:name w:val="Heading 3 Char"/>
-    <w:basedOn w:val="1086"/>
+    <w:basedOn w:val="1089"/>
     <w:uiPriority w:val="9"/>
     <w:pPr>
       <w:pBdr/>
@@ -52799,10 +52821,10 @@
       <w:szCs w:val="28"/>
     </w:rPr>
   </w:style>
-  <w:style w:type="character" w:styleId="1229" w:customStyle="1">
+  <w:style w:type="character" w:styleId="1232" w:customStyle="1">
     <w:name w:val="Titre 4 Car"/>
-    <w:basedOn w:val="1086"/>
-    <w:link w:val="1080"/>
+    <w:basedOn w:val="1089"/>
+    <w:link w:val="1083"/>
     <w:uiPriority w:val="9"/>
     <w:pPr>
       <w:pBdr/>
@@ -52816,10 +52838,10 @@
       <w:color w:val="2f5496" w:themeColor="accent1" w:themeShade="BF"/>
     </w:rPr>
   </w:style>
-  <w:style w:type="character" w:styleId="1230" w:customStyle="1">
+  <w:style w:type="character" w:styleId="1233" w:customStyle="1">
     <w:name w:val="Titre 5 Car"/>
-    <w:basedOn w:val="1086"/>
-    <w:link w:val="1081"/>
+    <w:basedOn w:val="1089"/>
+    <w:link w:val="1084"/>
     <w:uiPriority w:val="9"/>
     <w:pPr>
       <w:pBdr/>
@@ -52831,10 +52853,10 @@
       <w:color w:val="2f5496" w:themeColor="accent1" w:themeShade="BF"/>
     </w:rPr>
   </w:style>
-  <w:style w:type="character" w:styleId="1231" w:customStyle="1">
+  <w:style w:type="character" w:styleId="1234" w:customStyle="1">
     <w:name w:val="Titre 6 Car"/>
-    <w:basedOn w:val="1086"/>
-    <w:link w:val="1082"/>
+    <w:basedOn w:val="1089"/>
+    <w:link w:val="1085"/>
     <w:uiPriority w:val="9"/>
     <w:pPr>
       <w:pBdr/>
@@ -52848,10 +52870,10 @@
       <w:color w:val="595959" w:themeColor="text1" w:themeTint="A6"/>
     </w:rPr>
   </w:style>
-  <w:style w:type="character" w:styleId="1232" w:customStyle="1">
+  <w:style w:type="character" w:styleId="1235" w:customStyle="1">
     <w:name w:val="Titre 7 Car"/>
-    <w:basedOn w:val="1086"/>
-    <w:link w:val="1083"/>
+    <w:basedOn w:val="1089"/>
+    <w:link w:val="1086"/>
     <w:uiPriority w:val="9"/>
     <w:pPr>
       <w:pBdr/>
@@ -52863,10 +52885,10 @@
       <w:color w:val="595959" w:themeColor="text1" w:themeTint="A6"/>
     </w:rPr>
   </w:style>
-  <w:style w:type="character" w:styleId="1233" w:customStyle="1">
+  <w:style w:type="character" w:styleId="1236" w:customStyle="1">
     <w:name w:val="Titre 8 Car"/>
-    <w:basedOn w:val="1086"/>
-    <w:link w:val="1084"/>
+    <w:basedOn w:val="1089"/>
+    <w:link w:val="1087"/>
     <w:uiPriority w:val="9"/>
     <w:pPr>
       <w:pBdr/>
@@ -52880,10 +52902,10 @@
       <w:color w:val="272727" w:themeColor="text1" w:themeTint="D8"/>
     </w:rPr>
   </w:style>
-  <w:style w:type="character" w:styleId="1234" w:customStyle="1">
+  <w:style w:type="character" w:styleId="1237" w:customStyle="1">
     <w:name w:val="Titre 9 Car"/>
-    <w:basedOn w:val="1086"/>
-    <w:link w:val="1085"/>
+    <w:basedOn w:val="1089"/>
+    <w:link w:val="1088"/>
     <w:uiPriority w:val="9"/>
     <w:pPr>
       <w:pBdr/>
@@ -52897,11 +52919,11 @@
       <w:color w:val="272727" w:themeColor="text1" w:themeTint="D8"/>
     </w:rPr>
   </w:style>
-  <w:style w:type="paragraph" w:styleId="1235">
+  <w:style w:type="paragraph" w:styleId="1238">
     <w:name w:val="Title"/>
-    <w:basedOn w:val="1076"/>
-    <w:next w:val="1076"/>
-    <w:link w:val="1236"/>
+    <w:basedOn w:val="1079"/>
+    <w:next w:val="1079"/>
+    <w:link w:val="1239"/>
     <w:uiPriority w:val="10"/>
     <w:qFormat/>
     <w:pPr>
@@ -52917,10 +52939,10 @@
       <w:szCs w:val="56"/>
     </w:rPr>
   </w:style>
-  <w:style w:type="character" w:styleId="1236" w:customStyle="1">
+  <w:style w:type="character" w:styleId="1239" w:customStyle="1">
     <w:name w:val="Titre Car"/>
-    <w:basedOn w:val="1086"/>
-    <w:link w:val="1235"/>
+    <w:basedOn w:val="1089"/>
+    <w:link w:val="1238"/>
     <w:uiPriority w:val="10"/>
     <w:pPr>
       <w:pBdr/>
@@ -52934,11 +52956,11 @@
       <w:szCs w:val="56"/>
     </w:rPr>
   </w:style>
-  <w:style w:type="paragraph" w:styleId="1237">
+  <w:style w:type="paragraph" w:styleId="1240">
     <w:name w:val="Subtitle"/>
-    <w:basedOn w:val="1076"/>
-    <w:next w:val="1076"/>
-    <w:link w:val="1238"/>
+    <w:basedOn w:val="1079"/>
+    <w:next w:val="1079"/>
+    <w:link w:val="1241"/>
     <w:uiPriority w:val="11"/>
     <w:qFormat/>
     <w:pPr>
@@ -52956,10 +52978,10 @@
       <w:szCs w:val="28"/>
     </w:rPr>
   </w:style>
-  <w:style w:type="character" w:styleId="1238" w:customStyle="1">
+  <w:style w:type="character" w:styleId="1241" w:customStyle="1">
     <w:name w:val="Sous-titre Car"/>
-    <w:basedOn w:val="1086"/>
-    <w:link w:val="1237"/>
+    <w:basedOn w:val="1089"/>
+    <w:link w:val="1240"/>
     <w:uiPriority w:val="11"/>
     <w:pPr>
       <w:pBdr/>
@@ -52973,11 +52995,11 @@
       <w:szCs w:val="28"/>
     </w:rPr>
   </w:style>
-  <w:style w:type="paragraph" w:styleId="1239">
+  <w:style w:type="paragraph" w:styleId="1242">
     <w:name w:val="Quote"/>
-    <w:basedOn w:val="1076"/>
-    <w:next w:val="1076"/>
-    <w:link w:val="1240"/>
+    <w:basedOn w:val="1079"/>
+    <w:next w:val="1079"/>
+    <w:link w:val="1243"/>
     <w:uiPriority w:val="29"/>
     <w:qFormat/>
     <w:pPr>
@@ -52992,10 +53014,10 @@
       <w:color w:val="404040" w:themeColor="text1" w:themeTint="BF"/>
     </w:rPr>
   </w:style>
-  <w:style w:type="character" w:styleId="1240" w:customStyle="1">
+  <w:style w:type="character" w:styleId="1243" w:customStyle="1">
     <w:name w:val="Citation Car"/>
-    <w:basedOn w:val="1086"/>
-    <w:link w:val="1239"/>
+    <w:basedOn w:val="1089"/>
+    <w:link w:val="1242"/>
     <w:uiPriority w:val="29"/>
     <w:pPr>
       <w:pBdr/>
@@ -53008,9 +53030,9 @@
       <w:color w:val="404040" w:themeColor="text1" w:themeTint="BF"/>
     </w:rPr>
   </w:style>
-  <w:style w:type="character" w:styleId="1241">
+  <w:style w:type="character" w:styleId="1244">
     <w:name w:val="Intense Emphasis"/>
-    <w:basedOn w:val="1086"/>
+    <w:basedOn w:val="1089"/>
     <w:uiPriority w:val="21"/>
     <w:qFormat/>
     <w:pPr>
@@ -53024,11 +53046,11 @@
       <w:color w:val="2f5496" w:themeColor="accent1" w:themeShade="BF"/>
     </w:rPr>
   </w:style>
-  <w:style w:type="paragraph" w:styleId="1242">
+  <w:style w:type="paragraph" w:styleId="1245">
     <w:name w:val="Intense Quote"/>
-    <w:basedOn w:val="1076"/>
-    <w:next w:val="1076"/>
-    <w:link w:val="1243"/>
+    <w:basedOn w:val="1079"/>
+    <w:next w:val="1079"/>
+    <w:link w:val="1246"/>
     <w:uiPriority w:val="30"/>
     <w:qFormat/>
     <w:pPr>
@@ -53046,10 +53068,10 @@
       <w:color w:val="2f5496" w:themeColor="accent1" w:themeShade="BF"/>
     </w:rPr>
   </w:style>
-  <w:style w:type="character" w:styleId="1243" w:customStyle="1">
+  <w:style w:type="character" w:styleId="1246" w:customStyle="1">
     <w:name w:val="Citation intense Car"/>
-    <w:basedOn w:val="1086"/>
-    <w:link w:val="1242"/>
+    <w:basedOn w:val="1089"/>
+    <w:link w:val="1245"/>
     <w:uiPriority w:val="30"/>
     <w:pPr>
       <w:pBdr/>
@@ -53062,9 +53084,9 @@
       <w:color w:val="2f5496" w:themeColor="accent1" w:themeShade="BF"/>
     </w:rPr>
   </w:style>
-  <w:style w:type="character" w:styleId="1244">
+  <w:style w:type="character" w:styleId="1247">
     <w:name w:val="Intense Reference"/>
-    <w:basedOn w:val="1086"/>
+    <w:basedOn w:val="1089"/>
     <w:uiPriority w:val="32"/>
     <w:qFormat/>
     <w:pPr>
@@ -53080,9 +53102,9 @@
       <w:spacing w:val="5"/>
     </w:rPr>
   </w:style>
-  <w:style w:type="character" w:styleId="1245">
+  <w:style w:type="character" w:styleId="1248">
     <w:name w:val="Subtle Emphasis"/>
-    <w:basedOn w:val="1086"/>
+    <w:basedOn w:val="1089"/>
     <w:uiPriority w:val="19"/>
     <w:qFormat/>
     <w:pPr>
@@ -53096,9 +53118,9 @@
       <w:color w:val="404040" w:themeColor="text1" w:themeTint="BF"/>
     </w:rPr>
   </w:style>
-  <w:style w:type="character" w:styleId="1246">
+  <w:style w:type="character" w:styleId="1249">
     <w:name w:val="Emphasis"/>
-    <w:basedOn w:val="1086"/>
+    <w:basedOn w:val="1089"/>
     <w:uiPriority w:val="20"/>
     <w:qFormat/>
     <w:pPr>
@@ -53111,9 +53133,9 @@
       <w:iCs/>
     </w:rPr>
   </w:style>
-  <w:style w:type="character" w:styleId="1247">
+  <w:style w:type="character" w:styleId="1250">
     <w:name w:val="Strong"/>
-    <w:basedOn w:val="1086"/>
+    <w:basedOn w:val="1089"/>
     <w:uiPriority w:val="22"/>
     <w:qFormat/>
     <w:pPr>
@@ -53126,9 +53148,9 @@
       <w:bCs/>
     </w:rPr>
   </w:style>
-  <w:style w:type="character" w:styleId="1248">
+  <w:style w:type="character" w:styleId="1251">
     <w:name w:val="Subtle Reference"/>
-    <w:basedOn w:val="1086"/>
+    <w:basedOn w:val="1089"/>
     <w:uiPriority w:val="31"/>
     <w:qFormat/>
     <w:pPr>
@@ -53141,9 +53163,9 @@
       <w:color w:val="5a5a5a" w:themeColor="text1" w:themeTint="A5"/>
     </w:rPr>
   </w:style>
-  <w:style w:type="character" w:styleId="1249">
+  <w:style w:type="character" w:styleId="1252">
     <w:name w:val="Book Title"/>
-    <w:basedOn w:val="1086"/>
+    <w:basedOn w:val="1089"/>
     <w:uiPriority w:val="33"/>
     <w:qFormat/>
     <w:pPr>
@@ -53159,9 +53181,9 @@
       <w:spacing w:val="5"/>
     </w:rPr>
   </w:style>
-  <w:style w:type="character" w:styleId="1250" w:customStyle="1">
+  <w:style w:type="character" w:styleId="1253" w:customStyle="1">
     <w:name w:val="Header Char"/>
-    <w:basedOn w:val="1086"/>
+    <w:basedOn w:val="1089"/>
     <w:uiPriority w:val="99"/>
     <w:pPr>
       <w:pBdr/>
@@ -53169,9 +53191,9 @@
       <w:ind/>
     </w:pPr>
   </w:style>
-  <w:style w:type="character" w:styleId="1251" w:customStyle="1">
+  <w:style w:type="character" w:styleId="1254" w:customStyle="1">
     <w:name w:val="Footer Char"/>
-    <w:basedOn w:val="1086"/>
+    <w:basedOn w:val="1089"/>
     <w:uiPriority w:val="99"/>
     <w:pPr>
       <w:pBdr/>
@@ -53179,57 +53201,9 @@
       <w:ind/>
     </w:pPr>
   </w:style>
-  <w:style w:type="paragraph" w:styleId="1252">
+  <w:style w:type="paragraph" w:styleId="1255">
     <w:name w:val="footnote text"/>
-    <w:basedOn w:val="1076"/>
-    <w:link w:val="1253"/>
-    <w:uiPriority w:val="99"/>
-    <w:semiHidden/>
-    <w:unhideWhenUsed/>
-    <w:pPr>
-      <w:pBdr/>
-      <w:spacing w:after="0" w:line="240" w:lineRule="auto"/>
-      <w:ind/>
-    </w:pPr>
-    <w:rPr>
-      <w:sz w:val="20"/>
-      <w:szCs w:val="20"/>
-    </w:rPr>
-  </w:style>
-  <w:style w:type="character" w:styleId="1253" w:customStyle="1">
-    <w:name w:val="Note de bas de page Car"/>
-    <w:basedOn w:val="1086"/>
-    <w:link w:val="1252"/>
-    <w:uiPriority w:val="99"/>
-    <w:semiHidden/>
-    <w:pPr>
-      <w:pBdr/>
-      <w:spacing/>
-      <w:ind/>
-    </w:pPr>
-    <w:rPr>
-      <w:sz w:val="20"/>
-      <w:szCs w:val="20"/>
-    </w:rPr>
-  </w:style>
-  <w:style w:type="character" w:styleId="1254">
-    <w:name w:val="footnote reference"/>
-    <w:basedOn w:val="1086"/>
-    <w:uiPriority w:val="99"/>
-    <w:semiHidden/>
-    <w:unhideWhenUsed/>
-    <w:pPr>
-      <w:pBdr/>
-      <w:spacing/>
-      <w:ind/>
-    </w:pPr>
-    <w:rPr>
-      <w:vertAlign w:val="superscript"/>
-    </w:rPr>
-  </w:style>
-  <w:style w:type="paragraph" w:styleId="1255">
-    <w:name w:val="endnote text"/>
-    <w:basedOn w:val="1076"/>
+    <w:basedOn w:val="1079"/>
     <w:link w:val="1256"/>
     <w:uiPriority w:val="99"/>
     <w:semiHidden/>
@@ -53245,8 +53219,8 @@
     </w:rPr>
   </w:style>
   <w:style w:type="character" w:styleId="1256" w:customStyle="1">
-    <w:name w:val="Note de fin Car"/>
-    <w:basedOn w:val="1086"/>
+    <w:name w:val="Note de bas de page Car"/>
+    <w:basedOn w:val="1089"/>
     <w:link w:val="1255"/>
     <w:uiPriority w:val="99"/>
     <w:semiHidden/>
@@ -53261,8 +53235,8 @@
     </w:rPr>
   </w:style>
   <w:style w:type="character" w:styleId="1257">
-    <w:name w:val="endnote reference"/>
-    <w:basedOn w:val="1086"/>
+    <w:name w:val="footnote reference"/>
+    <w:basedOn w:val="1089"/>
     <w:uiPriority w:val="99"/>
     <w:semiHidden/>
     <w:unhideWhenUsed/>
@@ -53275,9 +53249,57 @@
       <w:vertAlign w:val="superscript"/>
     </w:rPr>
   </w:style>
-  <w:style w:type="character" w:styleId="1258">
+  <w:style w:type="paragraph" w:styleId="1258">
+    <w:name w:val="endnote text"/>
+    <w:basedOn w:val="1079"/>
+    <w:link w:val="1259"/>
+    <w:uiPriority w:val="99"/>
+    <w:semiHidden/>
+    <w:unhideWhenUsed/>
+    <w:pPr>
+      <w:pBdr/>
+      <w:spacing w:after="0" w:line="240" w:lineRule="auto"/>
+      <w:ind/>
+    </w:pPr>
+    <w:rPr>
+      <w:sz w:val="20"/>
+      <w:szCs w:val="20"/>
+    </w:rPr>
+  </w:style>
+  <w:style w:type="character" w:styleId="1259" w:customStyle="1">
+    <w:name w:val="Note de fin Car"/>
+    <w:basedOn w:val="1089"/>
+    <w:link w:val="1258"/>
+    <w:uiPriority w:val="99"/>
+    <w:semiHidden/>
+    <w:pPr>
+      <w:pBdr/>
+      <w:spacing/>
+      <w:ind/>
+    </w:pPr>
+    <w:rPr>
+      <w:sz w:val="20"/>
+      <w:szCs w:val="20"/>
+    </w:rPr>
+  </w:style>
+  <w:style w:type="character" w:styleId="1260">
+    <w:name w:val="endnote reference"/>
+    <w:basedOn w:val="1089"/>
+    <w:uiPriority w:val="99"/>
+    <w:semiHidden/>
+    <w:unhideWhenUsed/>
+    <w:pPr>
+      <w:pBdr/>
+      <w:spacing/>
+      <w:ind/>
+    </w:pPr>
+    <w:rPr>
+      <w:vertAlign w:val="superscript"/>
+    </w:rPr>
+  </w:style>
+  <w:style w:type="character" w:styleId="1261">
     <w:name w:val="FollowedHyperlink"/>
-    <w:basedOn w:val="1086"/>
+    <w:basedOn w:val="1089"/>
     <w:uiPriority w:val="99"/>
     <w:semiHidden/>
     <w:unhideWhenUsed/>
@@ -53291,10 +53313,10 @@
       <w:u w:val="single"/>
     </w:rPr>
   </w:style>
-  <w:style w:type="paragraph" w:styleId="1259">
+  <w:style w:type="paragraph" w:styleId="1262">
     <w:name w:val="toc 4"/>
-    <w:basedOn w:val="1076"/>
-    <w:next w:val="1076"/>
+    <w:basedOn w:val="1079"/>
+    <w:next w:val="1079"/>
     <w:uiPriority w:val="39"/>
     <w:unhideWhenUsed/>
     <w:pPr>
@@ -53303,10 +53325,10 @@
       <w:ind w:left="660"/>
     </w:pPr>
   </w:style>
-  <w:style w:type="paragraph" w:styleId="1260">
+  <w:style w:type="paragraph" w:styleId="1263">
     <w:name w:val="toc 5"/>
-    <w:basedOn w:val="1076"/>
-    <w:next w:val="1076"/>
+    <w:basedOn w:val="1079"/>
+    <w:next w:val="1079"/>
     <w:uiPriority w:val="39"/>
     <w:unhideWhenUsed/>
     <w:pPr>
@@ -53315,10 +53337,10 @@
       <w:ind w:left="880"/>
     </w:pPr>
   </w:style>
-  <w:style w:type="paragraph" w:styleId="1261">
+  <w:style w:type="paragraph" w:styleId="1264">
     <w:name w:val="toc 6"/>
-    <w:basedOn w:val="1076"/>
-    <w:next w:val="1076"/>
+    <w:basedOn w:val="1079"/>
+    <w:next w:val="1079"/>
     <w:uiPriority w:val="39"/>
     <w:unhideWhenUsed/>
     <w:pPr>
@@ -53327,10 +53349,10 @@
       <w:ind w:left="1100"/>
     </w:pPr>
   </w:style>
-  <w:style w:type="paragraph" w:styleId="1262">
+  <w:style w:type="paragraph" w:styleId="1265">
     <w:name w:val="toc 7"/>
-    <w:basedOn w:val="1076"/>
-    <w:next w:val="1076"/>
+    <w:basedOn w:val="1079"/>
+    <w:next w:val="1079"/>
     <w:uiPriority w:val="39"/>
     <w:unhideWhenUsed/>
     <w:pPr>
@@ -53339,10 +53361,10 @@
       <w:ind w:left="1320"/>
     </w:pPr>
   </w:style>
-  <w:style w:type="paragraph" w:styleId="1263">
+  <w:style w:type="paragraph" w:styleId="1266">
     <w:name w:val="toc 8"/>
-    <w:basedOn w:val="1076"/>
-    <w:next w:val="1076"/>
+    <w:basedOn w:val="1079"/>
+    <w:next w:val="1079"/>
     <w:uiPriority w:val="39"/>
     <w:unhideWhenUsed/>
     <w:pPr>
@@ -53351,10 +53373,10 @@
       <w:ind w:left="1540"/>
     </w:pPr>
   </w:style>
-  <w:style w:type="paragraph" w:styleId="1264">
+  <w:style w:type="paragraph" w:styleId="1267">
     <w:name w:val="toc 9"/>
-    <w:basedOn w:val="1076"/>
-    <w:next w:val="1076"/>
+    <w:basedOn w:val="1079"/>
+    <w:next w:val="1079"/>
     <w:uiPriority w:val="39"/>
     <w:unhideWhenUsed/>
     <w:pPr>
@@ -53363,10 +53385,10 @@
       <w:ind w:left="1760"/>
     </w:pPr>
   </w:style>
-  <w:style w:type="paragraph" w:styleId="1265">
+  <w:style w:type="paragraph" w:styleId="1268">
     <w:name w:val="table of figures"/>
-    <w:basedOn w:val="1076"/>
-    <w:next w:val="1076"/>
+    <w:basedOn w:val="1079"/>
+    <w:next w:val="1079"/>
     <w:uiPriority w:val="99"/>
     <w:unhideWhenUsed/>
     <w:pPr>
@@ -53375,10 +53397,10 @@
       <w:ind/>
     </w:pPr>
   </w:style>
-  <w:style w:type="paragraph" w:styleId="1266">
+  <w:style w:type="paragraph" w:styleId="1269">
     <w:name w:val="Header"/>
-    <w:basedOn w:val="1076"/>
-    <w:link w:val="1267"/>
+    <w:basedOn w:val="1079"/>
+    <w:link w:val="1270"/>
     <w:uiPriority w:val="99"/>
     <w:unhideWhenUsed/>
     <w:pPr>
@@ -53391,10 +53413,10 @@
       <w:ind/>
     </w:pPr>
   </w:style>
-  <w:style w:type="character" w:styleId="1267" w:customStyle="1">
+  <w:style w:type="character" w:styleId="1270" w:customStyle="1">
     <w:name w:val="En-tête Car"/>
-    <w:basedOn w:val="1086"/>
-    <w:link w:val="1266"/>
+    <w:basedOn w:val="1089"/>
+    <w:link w:val="1269"/>
     <w:uiPriority w:val="99"/>
     <w:pPr>
       <w:pBdr/>
@@ -53402,10 +53424,10 @@
       <w:ind/>
     </w:pPr>
   </w:style>
-  <w:style w:type="paragraph" w:styleId="1268">
+  <w:style w:type="paragraph" w:styleId="1271">
     <w:name w:val="Footer"/>
-    <w:basedOn w:val="1076"/>
-    <w:link w:val="1269"/>
+    <w:basedOn w:val="1079"/>
+    <w:link w:val="1272"/>
     <w:uiPriority w:val="99"/>
     <w:unhideWhenUsed/>
     <w:pPr>
@@ -53418,10 +53440,10 @@
       <w:ind/>
     </w:pPr>
   </w:style>
-  <w:style w:type="character" w:styleId="1269" w:customStyle="1">
+  <w:style w:type="character" w:styleId="1272" w:customStyle="1">
     <w:name w:val="Pied de page Car"/>
-    <w:basedOn w:val="1086"/>
-    <w:link w:val="1268"/>
+    <w:basedOn w:val="1089"/>
+    <w:link w:val="1271"/>
     <w:uiPriority w:val="99"/>
     <w:pPr>
       <w:pBdr/>
@@ -53429,10 +53451,10 @@
       <w:ind/>
     </w:pPr>
   </w:style>
-  <w:style w:type="character" w:styleId="1270" w:customStyle="1">
+  <w:style w:type="character" w:styleId="1273" w:customStyle="1">
     <w:name w:val="Titre 1 Car"/>
-    <w:basedOn w:val="1086"/>
-    <w:link w:val="1077"/>
+    <w:basedOn w:val="1089"/>
+    <w:link w:val="1080"/>
     <w:uiPriority w:val="9"/>
     <w:pPr>
       <w:pBdr/>
@@ -53446,10 +53468,10 @@
       <w:szCs w:val="32"/>
     </w:rPr>
   </w:style>
-  <w:style w:type="paragraph" w:styleId="1271">
+  <w:style w:type="paragraph" w:styleId="1274">
     <w:name w:val="TOC Heading"/>
-    <w:basedOn w:val="1077"/>
-    <w:next w:val="1076"/>
+    <w:basedOn w:val="1080"/>
+    <w:next w:val="1079"/>
     <w:uiPriority w:val="39"/>
     <w:unhideWhenUsed/>
     <w:qFormat/>
@@ -53463,9 +53485,9 @@
       <w:lang w:eastAsia="fr-CH"/>
     </w:rPr>
   </w:style>
-  <w:style w:type="paragraph" w:styleId="1272">
+  <w:style w:type="paragraph" w:styleId="1275">
     <w:name w:val="No Spacing"/>
-    <w:link w:val="1273"/>
+    <w:link w:val="1276"/>
     <w:uiPriority w:val="1"/>
     <w:qFormat/>
     <w:pPr>
@@ -53478,10 +53500,10 @@
       <w:lang w:eastAsia="fr-CH"/>
     </w:rPr>
   </w:style>
-  <w:style w:type="character" w:styleId="1273" w:customStyle="1">
+  <w:style w:type="character" w:styleId="1276" w:customStyle="1">
     <w:name w:val="Sans interligne Car"/>
-    <w:basedOn w:val="1086"/>
-    <w:link w:val="1272"/>
+    <w:basedOn w:val="1089"/>
+    <w:link w:val="1275"/>
     <w:uiPriority w:val="1"/>
     <w:pPr>
       <w:pBdr/>
@@ -53493,10 +53515,10 @@
       <w:lang w:eastAsia="fr-CH"/>
     </w:rPr>
   </w:style>
-  <w:style w:type="paragraph" w:styleId="1274">
+  <w:style w:type="paragraph" w:styleId="1277">
     <w:name w:val="toc 1"/>
-    <w:basedOn w:val="1076"/>
-    <w:next w:val="1076"/>
+    <w:basedOn w:val="1079"/>
+    <w:next w:val="1079"/>
     <w:uiPriority w:val="39"/>
     <w:unhideWhenUsed/>
     <w:pPr>
@@ -53505,9 +53527,9 @@
       <w:ind/>
     </w:pPr>
   </w:style>
-  <w:style w:type="character" w:styleId="1275">
+  <w:style w:type="character" w:styleId="1278">
     <w:name w:val="Hyperlink"/>
-    <w:basedOn w:val="1086"/>
+    <w:basedOn w:val="1089"/>
     <w:uiPriority w:val="99"/>
     <w:unhideWhenUsed/>
     <w:pPr>
@@ -53520,10 +53542,10 @@
       <w:u w:val="single"/>
     </w:rPr>
   </w:style>
-  <w:style w:type="character" w:styleId="1276" w:customStyle="1">
+  <w:style w:type="character" w:styleId="1279" w:customStyle="1">
     <w:name w:val="Titre 2 Car"/>
-    <w:basedOn w:val="1086"/>
-    <w:link w:val="1078"/>
+    <w:basedOn w:val="1089"/>
+    <w:link w:val="1081"/>
     <w:uiPriority w:val="9"/>
     <w:pPr>
       <w:pBdr/>
@@ -53537,10 +53559,10 @@
       <w:szCs w:val="26"/>
     </w:rPr>
   </w:style>
-  <w:style w:type="paragraph" w:styleId="1277">
+  <w:style w:type="paragraph" w:styleId="1280">
     <w:name w:val="toc 2"/>
-    <w:basedOn w:val="1076"/>
-    <w:next w:val="1076"/>
+    <w:basedOn w:val="1079"/>
+    <w:next w:val="1079"/>
     <w:uiPriority w:val="39"/>
     <w:unhideWhenUsed/>
     <w:pPr>
@@ -53549,9 +53571,9 @@
       <w:ind w:left="220"/>
     </w:pPr>
   </w:style>
-  <w:style w:type="paragraph" w:styleId="1278">
+  <w:style w:type="paragraph" w:styleId="1281">
     <w:name w:val="List Paragraph"/>
-    <w:basedOn w:val="1076"/>
+    <w:basedOn w:val="1079"/>
     <w:uiPriority w:val="34"/>
     <w:qFormat/>
     <w:pPr>
@@ -53561,10 +53583,10 @@
       <w:contextualSpacing w:val="true"/>
     </w:pPr>
   </w:style>
-  <w:style w:type="paragraph" w:styleId="1279">
+  <w:style w:type="paragraph" w:styleId="1282">
     <w:name w:val="Caption"/>
-    <w:basedOn w:val="1076"/>
-    <w:next w:val="1076"/>
+    <w:basedOn w:val="1079"/>
+    <w:next w:val="1079"/>
     <w:uiPriority w:val="35"/>
     <w:unhideWhenUsed/>
     <w:qFormat/>
@@ -53581,9 +53603,9 @@
       <w:szCs w:val="18"/>
     </w:rPr>
   </w:style>
-  <w:style w:type="character" w:styleId="1280">
+  <w:style w:type="character" w:styleId="1283">
     <w:name w:val="annotation reference"/>
-    <w:basedOn w:val="1086"/>
+    <w:basedOn w:val="1089"/>
     <w:uiPriority w:val="99"/>
     <w:semiHidden/>
     <w:unhideWhenUsed/>
@@ -53597,10 +53619,10 @@
       <w:szCs w:val="16"/>
     </w:rPr>
   </w:style>
-  <w:style w:type="paragraph" w:styleId="1281">
+  <w:style w:type="paragraph" w:styleId="1284">
     <w:name w:val="annotation text"/>
-    <w:basedOn w:val="1076"/>
-    <w:link w:val="1282"/>
+    <w:basedOn w:val="1079"/>
+    <w:link w:val="1285"/>
     <w:uiPriority w:val="99"/>
     <w:unhideWhenUsed/>
     <w:pPr>
@@ -53613,10 +53635,10 @@
       <w:szCs w:val="20"/>
     </w:rPr>
   </w:style>
-  <w:style w:type="character" w:styleId="1282" w:customStyle="1">
+  <w:style w:type="character" w:styleId="1285" w:customStyle="1">
     <w:name w:val="Commentaire Car"/>
-    <w:basedOn w:val="1086"/>
-    <w:link w:val="1281"/>
+    <w:basedOn w:val="1089"/>
+    <w:link w:val="1284"/>
     <w:uiPriority w:val="99"/>
     <w:pPr>
       <w:pBdr/>
@@ -53628,11 +53650,11 @@
       <w:szCs w:val="20"/>
     </w:rPr>
   </w:style>
-  <w:style w:type="paragraph" w:styleId="1283">
+  <w:style w:type="paragraph" w:styleId="1286">
     <w:name w:val="annotation subject"/>
-    <w:basedOn w:val="1281"/>
-    <w:next w:val="1281"/>
-    <w:link w:val="1284"/>
+    <w:basedOn w:val="1284"/>
+    <w:next w:val="1284"/>
+    <w:link w:val="1287"/>
     <w:uiPriority w:val="99"/>
     <w:semiHidden/>
     <w:unhideWhenUsed/>
@@ -53646,10 +53668,10 @@
       <w:bCs/>
     </w:rPr>
   </w:style>
-  <w:style w:type="character" w:styleId="1284" w:customStyle="1">
+  <w:style w:type="character" w:styleId="1287" w:customStyle="1">
     <w:name w:val="Objet du commentaire Car"/>
-    <w:basedOn w:val="1282"/>
-    <w:link w:val="1283"/>
+    <w:basedOn w:val="1285"/>
+    <w:link w:val="1286"/>
     <w:uiPriority w:val="99"/>
     <w:semiHidden/>
     <w:pPr>
@@ -53664,9 +53686,9 @@
       <w:szCs w:val="20"/>
     </w:rPr>
   </w:style>
-  <w:style w:type="table" w:styleId="1285">
+  <w:style w:type="table" w:styleId="1288">
     <w:name w:val="Table Grid"/>
-    <w:basedOn w:val="1087"/>
+    <w:basedOn w:val="1090"/>
     <w:uiPriority w:val="39"/>
     <w:pPr>
       <w:pBdr/>
@@ -53856,9 +53878,9 @@
       </w:tcPr>
     </w:tblStylePr>
   </w:style>
-  <w:style w:type="table" w:styleId="1286">
+  <w:style w:type="table" w:styleId="1289">
     <w:name w:val="Grid Table 4 Accent 1"/>
-    <w:basedOn w:val="1087"/>
+    <w:basedOn w:val="1090"/>
     <w:uiPriority w:val="49"/>
     <w:pPr>
       <w:pBdr/>
@@ -54077,9 +54099,9 @@
       </w:tcPr>
     </w:tblStylePr>
   </w:style>
-  <w:style w:type="table" w:styleId="1287">
+  <w:style w:type="table" w:styleId="1290">
     <w:name w:val="Grid Table 5 Dark Accent 1"/>
-    <w:basedOn w:val="1087"/>
+    <w:basedOn w:val="1090"/>
     <w:uiPriority w:val="50"/>
     <w:pPr>
       <w:pBdr/>
@@ -54314,10 +54336,10 @@
       </w:tcPr>
     </w:tblStylePr>
   </w:style>
-  <w:style w:type="character" w:styleId="1288" w:customStyle="1">
+  <w:style w:type="character" w:styleId="1291" w:customStyle="1">
     <w:name w:val="Titre 3 Car"/>
-    <w:basedOn w:val="1086"/>
-    <w:link w:val="1079"/>
+    <w:basedOn w:val="1089"/>
+    <w:link w:val="1082"/>
     <w:uiPriority w:val="9"/>
     <w:pPr>
       <w:pBdr/>
@@ -54331,10 +54353,10 @@
       <w:szCs w:val="24"/>
     </w:rPr>
   </w:style>
-  <w:style w:type="paragraph" w:styleId="1289">
+  <w:style w:type="paragraph" w:styleId="1292">
     <w:name w:val="toc 3"/>
-    <w:basedOn w:val="1076"/>
-    <w:next w:val="1076"/>
+    <w:basedOn w:val="1079"/>
+    <w:next w:val="1079"/>
     <w:uiPriority w:val="39"/>
     <w:unhideWhenUsed/>
     <w:pPr>
@@ -54343,10 +54365,10 @@
       <w:ind w:left="440"/>
     </w:pPr>
   </w:style>
-  <w:style w:type="table" w:styleId="1290" w:customStyle="1">
+  <w:style w:type="table" w:styleId="1293" w:customStyle="1">
     <w:name w:val="Tableau Grille 41"/>
-    <w:basedOn w:val="1087"/>
-    <w:next w:val="1291"/>
+    <w:basedOn w:val="1090"/>
+    <w:next w:val="1294"/>
     <w:uiPriority w:val="49"/>
     <w:pPr>
       <w:pBdr/>
@@ -54568,9 +54590,9 @@
       </w:tcPr>
     </w:tblStylePr>
   </w:style>
-  <w:style w:type="table" w:styleId="1291">
+  <w:style w:type="table" w:styleId="1294">
     <w:name w:val="Grid Table 4"/>
-    <w:basedOn w:val="1087"/>
+    <w:basedOn w:val="1090"/>
     <w:uiPriority w:val="49"/>
     <w:pPr>
       <w:pBdr/>
@@ -54789,9 +54811,9 @@
       </w:tcPr>
     </w:tblStylePr>
   </w:style>
-  <w:style w:type="character" w:styleId="1292">
+  <w:style w:type="character" w:styleId="1295">
     <w:name w:val="Unresolved Mention"/>
-    <w:basedOn w:val="1086"/>
+    <w:basedOn w:val="1089"/>
     <w:uiPriority w:val="99"/>
     <w:semiHidden/>
     <w:unhideWhenUsed/>
@@ -54805,9 +54827,9 @@
       <w:shd w:val="clear" w:color="auto" w:fill="e1dfdd"/>
     </w:rPr>
   </w:style>
-  <w:style w:type="table" w:styleId="1293">
+  <w:style w:type="table" w:styleId="1296">
     <w:name w:val="Grid Table 4 Accent 5"/>
-    <w:basedOn w:val="1087"/>
+    <w:basedOn w:val="1090"/>
     <w:uiPriority w:val="49"/>
     <w:pPr>
       <w:pBdr/>
@@ -55026,9 +55048,9 @@
       </w:tcPr>
     </w:tblStylePr>
   </w:style>
-  <w:style w:type="character" w:styleId="1294" w:customStyle="1">
+  <w:style w:type="character" w:styleId="1297" w:customStyle="1">
     <w:name w:val="Style1 Car"/>
-    <w:basedOn w:val="1270"/>
+    <w:basedOn w:val="1273"/>
     <w:pPr>
       <w:pBdr/>
       <w:spacing/>
@@ -55041,9 +55063,9 @@
       <w:szCs w:val="32"/>
     </w:rPr>
   </w:style>
-  <w:style w:type="paragraph" w:styleId="1295">
+  <w:style w:type="paragraph" w:styleId="1298">
     <w:name w:val="Normal (Web)"/>
-    <w:basedOn w:val="1076"/>
+    <w:basedOn w:val="1079"/>
     <w:uiPriority w:val="99"/>
     <w:semiHidden/>
     <w:unhideWhenUsed/>
@@ -55059,9 +55081,9 @@
       <w:lang w:val="fr-CH" w:eastAsia="fr-CH"/>
     </w:rPr>
   </w:style>
-  <w:style w:type="character" w:styleId="1296">
+  <w:style w:type="character" w:styleId="1299">
     <w:name w:val="HTML Code"/>
-    <w:basedOn w:val="1086"/>
+    <w:basedOn w:val="1089"/>
     <w:uiPriority w:val="99"/>
     <w:semiHidden/>
     <w:unhideWhenUsed/>
@@ -55076,9 +55098,9 @@
       <w:szCs w:val="20"/>
     </w:rPr>
   </w:style>
-  <w:style w:type="table" w:styleId="1297">
+  <w:style w:type="table" w:styleId="1300">
     <w:name w:val="Grid Table 5 Dark Accent 5"/>
-    <w:basedOn w:val="1087"/>
+    <w:basedOn w:val="1090"/>
     <w:uiPriority w:val="50"/>
     <w:pPr>
       <w:pBdr/>

</xml_diff>